<commit_message>
change administrator and predlagatelj FE premissions for comp....
</commit_message>
<xml_diff>
--- a/diplomskiDoc2.docx
+++ b/diplomskiDoc2.docx
@@ -8700,15 +8700,14 @@
           <w:rFonts w:ascii="Times New Roman" w:hAnsi="Times New Roman" w:cs="Times New Roman"/>
           <w:b/>
           <w:bCs/>
-          <w:noProof/>
-          <w:sz w:val="28"/>
-          <w:szCs w:val="28"/>
+          <w:sz w:val="24"/>
+          <w:szCs w:val="24"/>
         </w:rPr>
         <w:drawing>
-          <wp:inline distT="0" distB="0" distL="0" distR="0" wp14:anchorId="072479C8" wp14:editId="4946F280">
-            <wp:extent cx="3039841" cy="1493520"/>
-            <wp:effectExtent l="0" t="0" r="8255" b="0"/>
-            <wp:docPr id="1410700448" name="Slika 1" descr="Slika na kojoj se prikazuje tekst, snimka zaslona, Font&#10;&#10;Sadržaj generiran uz AI možda nije točan."/>
+          <wp:inline distT="0" distB="0" distL="0" distR="0" wp14:anchorId="079ED0A6" wp14:editId="56366C8E">
+            <wp:extent cx="2346032" cy="2166474"/>
+            <wp:effectExtent l="0" t="0" r="0" b="5715"/>
+            <wp:docPr id="974170968" name="Slika 1" descr="Slika na kojoj se prikazuje tekst, snimka zaslona, Font, dizajn&#10;&#10;Sadržaj generiran uz AI možda nije točan."/>
             <wp:cNvGraphicFramePr>
               <a:graphicFrameLocks xmlns:a="http://schemas.openxmlformats.org/drawingml/2006/main" noChangeAspect="1"/>
             </wp:cNvGraphicFramePr>
@@ -8716,7 +8715,7 @@
               <a:graphicData uri="http://schemas.openxmlformats.org/drawingml/2006/picture">
                 <pic:pic xmlns:pic="http://schemas.openxmlformats.org/drawingml/2006/picture">
                   <pic:nvPicPr>
-                    <pic:cNvPr id="1410700448" name="Slika 1" descr="Slika na kojoj se prikazuje tekst, snimka zaslona, Font&#10;&#10;Sadržaj generiran uz AI možda nije točan."/>
+                    <pic:cNvPr id="974170968" name="Slika 1" descr="Slika na kojoj se prikazuje tekst, snimka zaslona, Font, dizajn&#10;&#10;Sadržaj generiran uz AI možda nije točan."/>
                     <pic:cNvPicPr/>
                   </pic:nvPicPr>
                   <pic:blipFill>
@@ -8728,7 +8727,7 @@
                   <pic:spPr>
                     <a:xfrm>
                       <a:off x="0" y="0"/>
-                      <a:ext cx="3084330" cy="1515378"/>
+                      <a:ext cx="2413055" cy="2228367"/>
                     </a:xfrm>
                     <a:prstGeom prst="rect">
                       <a:avLst/>
@@ -8956,6 +8955,7 @@
           <w:sz w:val="24"/>
           <w:szCs w:val="24"/>
         </w:rPr>
+        <w:lastRenderedPageBreak/>
         <w:t>Unutar sloja nalaze se i pripadajući DTO modeli koji služe kao povratni tipovi za konkretne entitete iz baze, oni sadrže samo podatke koji su potrebni za njihov prikaz na web aplikacij</w:t>
       </w:r>
       <w:r>
@@ -8972,16 +8972,7 @@
           <w:sz w:val="24"/>
           <w:szCs w:val="24"/>
         </w:rPr>
-        <w:t xml:space="preserve">. </w:t>
-      </w:r>
-      <w:r>
-        <w:rPr>
-          <w:rFonts w:ascii="Times New Roman" w:hAnsi="Times New Roman" w:cs="Times New Roman"/>
-          <w:sz w:val="24"/>
-          <w:szCs w:val="24"/>
-        </w:rPr>
-        <w:lastRenderedPageBreak/>
-        <w:t>Koriste se prilikom slanja podataka između slojeva aplikacije ili vanjsko</w:t>
+        <w:t>. Koriste se prilikom slanja podataka između slojeva aplikacije ili vanjsko</w:t>
       </w:r>
       <w:r>
         <w:rPr>
@@ -9617,7 +9608,71 @@
           <w:sz w:val="24"/>
           <w:szCs w:val="24"/>
         </w:rPr>
-        <w:t>@Column“ se koristi za mapiranje atributa na stupce u bazi te omogućavanje dodatnih postavki kao što su „nullable“, „unique“, „length“ i slično. Svaki atribut unutar modela ima pridružene gettere i settere što omogućava čitanje i pisanje njegove vrijednosti. Ovim pristupnim metodama frameworku se omogućuje automatska serializacija, deserializacija i mapiranje podataka.</w:t>
+        <w:t xml:space="preserve">@Column“ se koristi za mapiranje atributa na stupce u bazi te omogućavanje dodatnih postavki kao što su „nullable“, „unique“, „length“ i slično. Svaki atribut unutar modela ima pridružene </w:t>
+      </w:r>
+      <w:r>
+        <w:rPr>
+          <w:rFonts w:ascii="Times New Roman" w:hAnsi="Times New Roman" w:cs="Times New Roman"/>
+          <w:sz w:val="24"/>
+          <w:szCs w:val="24"/>
+        </w:rPr>
+        <w:t>„</w:t>
+      </w:r>
+      <w:r>
+        <w:rPr>
+          <w:rFonts w:ascii="Times New Roman" w:hAnsi="Times New Roman" w:cs="Times New Roman"/>
+          <w:sz w:val="24"/>
+          <w:szCs w:val="24"/>
+        </w:rPr>
+        <w:t>gettere</w:t>
+      </w:r>
+      <w:r>
+        <w:rPr>
+          <w:rFonts w:ascii="Times New Roman" w:hAnsi="Times New Roman" w:cs="Times New Roman"/>
+          <w:sz w:val="24"/>
+          <w:szCs w:val="24"/>
+        </w:rPr>
+        <w:t>“</w:t>
+      </w:r>
+      <w:r>
+        <w:rPr>
+          <w:rFonts w:ascii="Times New Roman" w:hAnsi="Times New Roman" w:cs="Times New Roman"/>
+          <w:sz w:val="24"/>
+          <w:szCs w:val="24"/>
+        </w:rPr>
+        <w:t xml:space="preserve"> i </w:t>
+      </w:r>
+      <w:r>
+        <w:rPr>
+          <w:rFonts w:ascii="Times New Roman" w:hAnsi="Times New Roman" w:cs="Times New Roman"/>
+          <w:sz w:val="24"/>
+          <w:szCs w:val="24"/>
+        </w:rPr>
+        <w:t>„</w:t>
+      </w:r>
+      <w:r>
+        <w:rPr>
+          <w:rFonts w:ascii="Times New Roman" w:hAnsi="Times New Roman" w:cs="Times New Roman"/>
+          <w:sz w:val="24"/>
+          <w:szCs w:val="24"/>
+        </w:rPr>
+        <w:t>settere</w:t>
+      </w:r>
+      <w:r>
+        <w:rPr>
+          <w:rFonts w:ascii="Times New Roman" w:hAnsi="Times New Roman" w:cs="Times New Roman"/>
+          <w:sz w:val="24"/>
+          <w:szCs w:val="24"/>
+        </w:rPr>
+        <w:t>“</w:t>
+      </w:r>
+      <w:r>
+        <w:rPr>
+          <w:rFonts w:ascii="Times New Roman" w:hAnsi="Times New Roman" w:cs="Times New Roman"/>
+          <w:sz w:val="24"/>
+          <w:szCs w:val="24"/>
+        </w:rPr>
+        <w:t xml:space="preserve"> što omogućava čitanje i pisanje njegove vrijednosti. Ovim pristupnim metodama frameworku se omogućuje automatska serializacija, deserializacija i mapiranje podataka.</w:t>
       </w:r>
     </w:p>
     <w:p>
@@ -11100,10 +11155,65 @@
           <w:rFonts w:ascii="Times New Roman" w:hAnsi="Times New Roman" w:cs="Times New Roman"/>
           <w:noProof/>
         </w:rPr>
+        <w:drawing>
+          <wp:anchor distT="0" distB="0" distL="114300" distR="114300" simplePos="0" relativeHeight="251662336" behindDoc="0" locked="0" layoutInCell="1" allowOverlap="1" wp14:anchorId="19CA33C3" wp14:editId="17CE603B">
+            <wp:simplePos x="0" y="0"/>
+            <wp:positionH relativeFrom="column">
+              <wp:posOffset>-1270</wp:posOffset>
+            </wp:positionH>
+            <wp:positionV relativeFrom="paragraph">
+              <wp:posOffset>2847772</wp:posOffset>
+            </wp:positionV>
+            <wp:extent cx="5939790" cy="2833370"/>
+            <wp:effectExtent l="0" t="0" r="3810" b="5080"/>
+            <wp:wrapSquare wrapText="bothSides"/>
+            <wp:docPr id="187800226" name="Slika 1" descr="Slika na kojoj se prikazuje tekst, snimka zaslona, softver, Multimedijski softver&#10;&#10;Sadržaj generiran uz AI možda nije točan."/>
+            <wp:cNvGraphicFramePr>
+              <a:graphicFrameLocks xmlns:a="http://schemas.openxmlformats.org/drawingml/2006/main" noChangeAspect="1"/>
+            </wp:cNvGraphicFramePr>
+            <a:graphic xmlns:a="http://schemas.openxmlformats.org/drawingml/2006/main">
+              <a:graphicData uri="http://schemas.openxmlformats.org/drawingml/2006/picture">
+                <pic:pic xmlns:pic="http://schemas.openxmlformats.org/drawingml/2006/picture">
+                  <pic:nvPicPr>
+                    <pic:cNvPr id="187800226" name="Slika 1" descr="Slika na kojoj se prikazuje tekst, snimka zaslona, softver, Multimedijski softver&#10;&#10;Sadržaj generiran uz AI možda nije točan."/>
+                    <pic:cNvPicPr/>
+                  </pic:nvPicPr>
+                  <pic:blipFill>
+                    <a:blip r:embed="rId23">
+                      <a:extLst>
+                        <a:ext uri="{28A0092B-C50C-407E-A947-70E740481C1C}">
+                          <a14:useLocalDpi xmlns:a14="http://schemas.microsoft.com/office/drawing/2010/main" val="0"/>
+                        </a:ext>
+                      </a:extLst>
+                    </a:blip>
+                    <a:stretch>
+                      <a:fillRect/>
+                    </a:stretch>
+                  </pic:blipFill>
+                  <pic:spPr>
+                    <a:xfrm>
+                      <a:off x="0" y="0"/>
+                      <a:ext cx="5939790" cy="2833370"/>
+                    </a:xfrm>
+                    <a:prstGeom prst="rect">
+                      <a:avLst/>
+                    </a:prstGeom>
+                  </pic:spPr>
+                </pic:pic>
+              </a:graphicData>
+            </a:graphic>
+          </wp:anchor>
+        </w:drawing>
+      </w:r>
+      <w:r>
+        <w:rPr>
+          <w:rFonts w:ascii="Times New Roman" w:hAnsi="Times New Roman" w:cs="Times New Roman"/>
+          <w:noProof/>
+        </w:rPr>
         <mc:AlternateContent>
           <mc:Choice Requires="wps">
             <w:drawing>
-              <wp:anchor distT="0" distB="0" distL="114300" distR="114300" simplePos="0" relativeHeight="251664384" behindDoc="0" locked="0" layoutInCell="1" allowOverlap="1" wp14:anchorId="3CCFE2BE" wp14:editId="4D346AFB">
+              <wp:anchor distT="0" distB="0" distL="114300" distR="114300" simplePos="0" relativeHeight="251664384" behindDoc="0" locked="0" layoutInCell="1" allowOverlap="1" wp14:anchorId="3CCFE2BE" wp14:editId="4CE3E356">
                 <wp:simplePos x="0" y="0"/>
                 <wp:positionH relativeFrom="column">
                   <wp:posOffset>-1270</wp:posOffset>
@@ -11598,61 +11708,6 @@
         <w:rPr>
           <w:rFonts w:ascii="Times New Roman" w:hAnsi="Times New Roman" w:cs="Times New Roman"/>
           <w:noProof/>
-        </w:rPr>
-        <w:drawing>
-          <wp:anchor distT="0" distB="0" distL="114300" distR="114300" simplePos="0" relativeHeight="251662336" behindDoc="0" locked="0" layoutInCell="1" allowOverlap="1" wp14:anchorId="19CA33C3" wp14:editId="5A003B37">
-            <wp:simplePos x="0" y="0"/>
-            <wp:positionH relativeFrom="column">
-              <wp:posOffset>-1270</wp:posOffset>
-            </wp:positionH>
-            <wp:positionV relativeFrom="paragraph">
-              <wp:posOffset>6049645</wp:posOffset>
-            </wp:positionV>
-            <wp:extent cx="5939790" cy="2833370"/>
-            <wp:effectExtent l="0" t="0" r="3810" b="5080"/>
-            <wp:wrapSquare wrapText="bothSides"/>
-            <wp:docPr id="187800226" name="Slika 1" descr="Slika na kojoj se prikazuje tekst, snimka zaslona, softver, Multimedijski softver&#10;&#10;Sadržaj generiran uz AI možda nije točan."/>
-            <wp:cNvGraphicFramePr>
-              <a:graphicFrameLocks xmlns:a="http://schemas.openxmlformats.org/drawingml/2006/main" noChangeAspect="1"/>
-            </wp:cNvGraphicFramePr>
-            <a:graphic xmlns:a="http://schemas.openxmlformats.org/drawingml/2006/main">
-              <a:graphicData uri="http://schemas.openxmlformats.org/drawingml/2006/picture">
-                <pic:pic xmlns:pic="http://schemas.openxmlformats.org/drawingml/2006/picture">
-                  <pic:nvPicPr>
-                    <pic:cNvPr id="187800226" name="Slika 1" descr="Slika na kojoj se prikazuje tekst, snimka zaslona, softver, Multimedijski softver&#10;&#10;Sadržaj generiran uz AI možda nije točan."/>
-                    <pic:cNvPicPr/>
-                  </pic:nvPicPr>
-                  <pic:blipFill>
-                    <a:blip r:embed="rId23">
-                      <a:extLst>
-                        <a:ext uri="{28A0092B-C50C-407E-A947-70E740481C1C}">
-                          <a14:useLocalDpi xmlns:a14="http://schemas.microsoft.com/office/drawing/2010/main" val="0"/>
-                        </a:ext>
-                      </a:extLst>
-                    </a:blip>
-                    <a:stretch>
-                      <a:fillRect/>
-                    </a:stretch>
-                  </pic:blipFill>
-                  <pic:spPr>
-                    <a:xfrm>
-                      <a:off x="0" y="0"/>
-                      <a:ext cx="5939790" cy="2833370"/>
-                    </a:xfrm>
-                    <a:prstGeom prst="rect">
-                      <a:avLst/>
-                    </a:prstGeom>
-                  </pic:spPr>
-                </pic:pic>
-              </a:graphicData>
-            </a:graphic>
-          </wp:anchor>
-        </w:drawing>
-      </w:r>
-      <w:r>
-        <w:rPr>
-          <w:rFonts w:ascii="Times New Roman" w:hAnsi="Times New Roman" w:cs="Times New Roman"/>
-          <w:noProof/>
           <w:sz w:val="24"/>
           <w:szCs w:val="24"/>
         </w:rPr>
@@ -12667,7 +12722,39 @@
           <w:sz w:val="24"/>
           <w:szCs w:val="24"/>
         </w:rPr>
-        <w:t xml:space="preserve"> Unutar kontrolnog sloja provjeravaju se ulazni podaci koji se šalju kao parametri te se prosljeđuju na daljnju obradu servisnom sloju. Najčešće kontrolni sloj obrađuje CRUD zahtjeve koji su ključni za kreiranje, čitanje, ažuriranje i brisanje podataka unutar baze podataka. Jedna klasa kontrolera može koristiti više različitih klasi servisnog sloja unutar sebe. UserController  klasa odgovorna je za upravljanje zahtjevima za prijavu i registraciju novih i postojećih korisnika.</w:t>
+        <w:t xml:space="preserve"> Unutar kontrolnog sloja provjeravaju se ulazni podaci koji se šalju kao parametri te se prosljeđuju na daljnju obradu servisnom sloju. Najčešće kontrolni sloj obrađuje CRUD zahtjeve koji su ključni za kreiranje, čitanje, ažuriranje i brisanje podataka unutar baze podataka. Jedna klasa kontrolera može koristiti više različitih klasi servisnog sloja unutar sebe. </w:t>
+      </w:r>
+      <w:r>
+        <w:rPr>
+          <w:rFonts w:ascii="Times New Roman" w:hAnsi="Times New Roman" w:cs="Times New Roman"/>
+          <w:sz w:val="24"/>
+          <w:szCs w:val="24"/>
+        </w:rPr>
+        <w:t>„</w:t>
+      </w:r>
+      <w:r>
+        <w:rPr>
+          <w:rFonts w:ascii="Times New Roman" w:hAnsi="Times New Roman" w:cs="Times New Roman"/>
+          <w:sz w:val="24"/>
+          <w:szCs w:val="24"/>
+        </w:rPr>
+        <w:t>UserController</w:t>
+      </w:r>
+      <w:r>
+        <w:rPr>
+          <w:rFonts w:ascii="Times New Roman" w:hAnsi="Times New Roman" w:cs="Times New Roman"/>
+          <w:sz w:val="24"/>
+          <w:szCs w:val="24"/>
+        </w:rPr>
+        <w:t>“</w:t>
+      </w:r>
+      <w:r>
+        <w:rPr>
+          <w:rFonts w:ascii="Times New Roman" w:hAnsi="Times New Roman" w:cs="Times New Roman"/>
+          <w:sz w:val="24"/>
+          <w:szCs w:val="24"/>
+        </w:rPr>
+        <w:t xml:space="preserve">  klasa odgovorna je za upravljanje zahtjevima za prijavu i registraciju novih i postojećih korisnika.</w:t>
       </w:r>
       <w:r>
         <w:rPr>
@@ -12694,6 +12781,182 @@
           <w:szCs w:val="24"/>
         </w:rPr>
         <w:t xml:space="preserve"> </w:t>
+      </w:r>
+      <w:r>
+        <w:rPr>
+          <w:rFonts w:ascii="Times New Roman" w:hAnsi="Times New Roman" w:cs="Times New Roman"/>
+          <w:sz w:val="24"/>
+          <w:szCs w:val="24"/>
+        </w:rPr>
+        <w:t>Osim toga koristi se za obradu zahtjeva za ažuriranje korisnikovog profila, promjenom lozinke te promjenom korisničke uloge</w:t>
+      </w:r>
+      <w:r>
+        <w:rPr>
+          <w:rFonts w:ascii="Times New Roman" w:hAnsi="Times New Roman" w:cs="Times New Roman"/>
+          <w:sz w:val="24"/>
+          <w:szCs w:val="24"/>
+        </w:rPr>
+        <w:t>.</w:t>
+      </w:r>
+      <w:r>
+        <w:rPr>
+          <w:rFonts w:ascii="Times New Roman" w:hAnsi="Times New Roman" w:cs="Times New Roman"/>
+          <w:sz w:val="24"/>
+          <w:szCs w:val="24"/>
+        </w:rPr>
+        <w:t xml:space="preserve"> </w:t>
+      </w:r>
+      <w:r>
+        <w:rPr>
+          <w:rFonts w:ascii="Times New Roman" w:hAnsi="Times New Roman" w:cs="Times New Roman"/>
+          <w:sz w:val="24"/>
+          <w:szCs w:val="24"/>
+        </w:rPr>
+        <w:t>S</w:t>
+      </w:r>
+      <w:r>
+        <w:rPr>
+          <w:rFonts w:ascii="Times New Roman" w:hAnsi="Times New Roman" w:cs="Times New Roman"/>
+          <w:sz w:val="24"/>
+          <w:szCs w:val="24"/>
+        </w:rPr>
+        <w:t xml:space="preserve">amo </w:t>
+      </w:r>
+      <w:r>
+        <w:rPr>
+          <w:rFonts w:ascii="Times New Roman" w:hAnsi="Times New Roman" w:cs="Times New Roman"/>
+          <w:sz w:val="24"/>
+          <w:szCs w:val="24"/>
+        </w:rPr>
+        <w:t>korisnici sa ulog</w:t>
+      </w:r>
+      <w:r>
+        <w:rPr>
+          <w:rFonts w:ascii="Times New Roman" w:hAnsi="Times New Roman" w:cs="Times New Roman"/>
+          <w:sz w:val="24"/>
+          <w:szCs w:val="24"/>
+        </w:rPr>
+        <w:t>ama</w:t>
+      </w:r>
+      <w:r>
+        <w:rPr>
+          <w:rFonts w:ascii="Times New Roman" w:hAnsi="Times New Roman" w:cs="Times New Roman"/>
+          <w:sz w:val="24"/>
+          <w:szCs w:val="24"/>
+        </w:rPr>
+        <w:t xml:space="preserve"> </w:t>
+      </w:r>
+      <w:r>
+        <w:rPr>
+          <w:rFonts w:ascii="Times New Roman" w:hAnsi="Times New Roman" w:cs="Times New Roman"/>
+          <w:sz w:val="24"/>
+          <w:szCs w:val="24"/>
+        </w:rPr>
+        <w:t xml:space="preserve"> admin</w:t>
+      </w:r>
+      <w:r>
+        <w:rPr>
+          <w:rFonts w:ascii="Times New Roman" w:hAnsi="Times New Roman" w:cs="Times New Roman"/>
+          <w:sz w:val="24"/>
+          <w:szCs w:val="24"/>
+        </w:rPr>
+        <w:t>a</w:t>
+      </w:r>
+      <w:r>
+        <w:rPr>
+          <w:rFonts w:ascii="Times New Roman" w:hAnsi="Times New Roman" w:cs="Times New Roman"/>
+          <w:sz w:val="24"/>
+          <w:szCs w:val="24"/>
+        </w:rPr>
+        <w:t xml:space="preserve">  i predlagatelja</w:t>
+      </w:r>
+      <w:r>
+        <w:rPr>
+          <w:rFonts w:ascii="Times New Roman" w:hAnsi="Times New Roman" w:cs="Times New Roman"/>
+          <w:sz w:val="24"/>
+          <w:szCs w:val="24"/>
+        </w:rPr>
+        <w:t xml:space="preserve"> mo</w:t>
+      </w:r>
+      <w:r>
+        <w:rPr>
+          <w:rFonts w:ascii="Times New Roman" w:hAnsi="Times New Roman" w:cs="Times New Roman"/>
+          <w:sz w:val="24"/>
+          <w:szCs w:val="24"/>
+        </w:rPr>
+        <w:t>gu</w:t>
+      </w:r>
+      <w:r>
+        <w:rPr>
+          <w:rFonts w:ascii="Times New Roman" w:hAnsi="Times New Roman" w:cs="Times New Roman"/>
+          <w:sz w:val="24"/>
+          <w:szCs w:val="24"/>
+        </w:rPr>
+        <w:t xml:space="preserve"> uređivati</w:t>
+      </w:r>
+      <w:r>
+        <w:rPr>
+          <w:rFonts w:ascii="Times New Roman" w:hAnsi="Times New Roman" w:cs="Times New Roman"/>
+          <w:sz w:val="24"/>
+          <w:szCs w:val="24"/>
+        </w:rPr>
+        <w:t xml:space="preserve"> </w:t>
+      </w:r>
+      <w:r>
+        <w:rPr>
+          <w:rFonts w:ascii="Times New Roman" w:hAnsi="Times New Roman" w:cs="Times New Roman"/>
+          <w:sz w:val="24"/>
+          <w:szCs w:val="24"/>
+        </w:rPr>
+        <w:t>drugim</w:t>
+      </w:r>
+      <w:r>
+        <w:rPr>
+          <w:rFonts w:ascii="Times New Roman" w:hAnsi="Times New Roman" w:cs="Times New Roman"/>
+          <w:sz w:val="24"/>
+          <w:szCs w:val="24"/>
+        </w:rPr>
+        <w:t xml:space="preserve"> postojeć</w:t>
+      </w:r>
+      <w:r>
+        <w:rPr>
+          <w:rFonts w:ascii="Times New Roman" w:hAnsi="Times New Roman" w:cs="Times New Roman"/>
+          <w:sz w:val="24"/>
+          <w:szCs w:val="24"/>
+        </w:rPr>
+        <w:t>im</w:t>
+      </w:r>
+      <w:r>
+        <w:rPr>
+          <w:rFonts w:ascii="Times New Roman" w:hAnsi="Times New Roman" w:cs="Times New Roman"/>
+          <w:sz w:val="24"/>
+          <w:szCs w:val="24"/>
+        </w:rPr>
+        <w:t xml:space="preserve"> korisni</w:t>
+      </w:r>
+      <w:r>
+        <w:rPr>
+          <w:rFonts w:ascii="Times New Roman" w:hAnsi="Times New Roman" w:cs="Times New Roman"/>
+          <w:sz w:val="24"/>
+          <w:szCs w:val="24"/>
+        </w:rPr>
+        <w:t>cima njihove uloge</w:t>
+      </w:r>
+      <w:r>
+        <w:rPr>
+          <w:rFonts w:ascii="Times New Roman" w:hAnsi="Times New Roman" w:cs="Times New Roman"/>
+          <w:sz w:val="24"/>
+          <w:szCs w:val="24"/>
+        </w:rPr>
+        <w:t>.</w:t>
+      </w:r>
+      <w:r>
+        <w:rPr>
+          <w:rFonts w:ascii="Times New Roman" w:hAnsi="Times New Roman" w:cs="Times New Roman"/>
+          <w:sz w:val="24"/>
+          <w:szCs w:val="24"/>
+        </w:rPr>
+        <w:t xml:space="preserve"> Većina metoda u kontrolnom sloju vrši provjeru korisnikove uloge sa tokena kako bih se ograničilo pravo pristupa određenim metodama. Ukoliko su metode javno dostupne bilo kome u aplikaciji nije postavljena autorizacija.</w:t>
       </w:r>
     </w:p>
     <w:p>
@@ -14166,7 +14429,23 @@
           <w:sz w:val="24"/>
           <w:szCs w:val="24"/>
         </w:rPr>
-        <w:t xml:space="preserve"> Na taj način provedena je autorizacja na razini pojedinog HTTP zahtjeva. </w:t>
+        <w:t xml:space="preserve"> Na taj način provedena je </w:t>
+      </w:r>
+      <w:r>
+        <w:rPr>
+          <w:rFonts w:ascii="Times New Roman" w:hAnsi="Times New Roman" w:cs="Times New Roman"/>
+          <w:sz w:val="24"/>
+          <w:szCs w:val="24"/>
+        </w:rPr>
+        <w:t>autorizacija</w:t>
+      </w:r>
+      <w:r>
+        <w:rPr>
+          <w:rFonts w:ascii="Times New Roman" w:hAnsi="Times New Roman" w:cs="Times New Roman"/>
+          <w:sz w:val="24"/>
+          <w:szCs w:val="24"/>
+        </w:rPr>
+        <w:t xml:space="preserve"> na razini pojedinog HTTP zahtjeva. </w:t>
       </w:r>
       <w:r>
         <w:rPr>
@@ -21222,13 +21501,303 @@
           <w:i w:val="0"/>
           <w:iCs w:val="0"/>
           <w:color w:val="auto"/>
+          <w:sz w:val="20"/>
+          <w:szCs w:val="20"/>
+        </w:rPr>
+      </w:pPr>
+      <w:r>
+        <w:rPr>
+          <w:rFonts w:ascii="Times New Roman" w:hAnsi="Times New Roman" w:cs="Times New Roman"/>
+          <w:b/>
+          <w:bCs/>
+          <w:i w:val="0"/>
+          <w:iCs w:val="0"/>
+          <w:color w:val="auto"/>
+          <w:sz w:val="20"/>
+          <w:szCs w:val="20"/>
+        </w:rPr>
+        <w:t xml:space="preserve">Slika </w:t>
+      </w:r>
+      <w:r>
+        <w:rPr>
+          <w:rFonts w:ascii="Times New Roman" w:hAnsi="Times New Roman" w:cs="Times New Roman"/>
+          <w:b/>
+          <w:bCs/>
+          <w:i w:val="0"/>
+          <w:iCs w:val="0"/>
+          <w:color w:val="auto"/>
+          <w:sz w:val="20"/>
+          <w:szCs w:val="20"/>
+        </w:rPr>
+        <w:fldChar w:fldCharType="begin"/>
+      </w:r>
+      <w:r>
+        <w:rPr>
+          <w:rFonts w:ascii="Times New Roman" w:hAnsi="Times New Roman" w:cs="Times New Roman"/>
+          <w:b/>
+          <w:bCs/>
+          <w:i w:val="0"/>
+          <w:iCs w:val="0"/>
+          <w:color w:val="auto"/>
+          <w:sz w:val="20"/>
+          <w:szCs w:val="20"/>
+        </w:rPr>
+        <w:instrText xml:space="preserve"> STYLEREF 1 \s </w:instrText>
+      </w:r>
+      <w:r>
+        <w:rPr>
+          <w:rFonts w:ascii="Times New Roman" w:hAnsi="Times New Roman" w:cs="Times New Roman"/>
+          <w:b/>
+          <w:bCs/>
+          <w:i w:val="0"/>
+          <w:iCs w:val="0"/>
+          <w:color w:val="auto"/>
+          <w:sz w:val="20"/>
+          <w:szCs w:val="20"/>
+        </w:rPr>
+        <w:fldChar w:fldCharType="separate"/>
+      </w:r>
+      <w:r>
+        <w:rPr>
+          <w:rFonts w:ascii="Times New Roman" w:hAnsi="Times New Roman" w:cs="Times New Roman"/>
+          <w:b/>
+          <w:bCs/>
+          <w:i w:val="0"/>
+          <w:iCs w:val="0"/>
+          <w:noProof/>
+          <w:color w:val="auto"/>
+          <w:sz w:val="20"/>
+          <w:szCs w:val="20"/>
+        </w:rPr>
+        <w:t>4</w:t>
+      </w:r>
+      <w:r>
+        <w:rPr>
+          <w:rFonts w:ascii="Times New Roman" w:hAnsi="Times New Roman" w:cs="Times New Roman"/>
+          <w:b/>
+          <w:bCs/>
+          <w:i w:val="0"/>
+          <w:iCs w:val="0"/>
+          <w:color w:val="auto"/>
+          <w:sz w:val="20"/>
+          <w:szCs w:val="20"/>
+        </w:rPr>
+        <w:fldChar w:fldCharType="end"/>
+      </w:r>
+      <w:r>
+        <w:rPr>
+          <w:rFonts w:ascii="Times New Roman" w:hAnsi="Times New Roman" w:cs="Times New Roman"/>
+          <w:b/>
+          <w:bCs/>
+          <w:i w:val="0"/>
+          <w:iCs w:val="0"/>
+          <w:color w:val="auto"/>
+          <w:sz w:val="20"/>
+          <w:szCs w:val="20"/>
+        </w:rPr>
+        <w:t>.</w:t>
+      </w:r>
+      <w:r>
+        <w:rPr>
+          <w:rFonts w:ascii="Times New Roman" w:hAnsi="Times New Roman" w:cs="Times New Roman"/>
+          <w:b/>
+          <w:bCs/>
+          <w:i w:val="0"/>
+          <w:iCs w:val="0"/>
+          <w:color w:val="auto"/>
+          <w:sz w:val="20"/>
+          <w:szCs w:val="20"/>
+        </w:rPr>
+        <w:fldChar w:fldCharType="begin"/>
+      </w:r>
+      <w:r>
+        <w:rPr>
+          <w:rFonts w:ascii="Times New Roman" w:hAnsi="Times New Roman" w:cs="Times New Roman"/>
+          <w:b/>
+          <w:bCs/>
+          <w:i w:val="0"/>
+          <w:iCs w:val="0"/>
+          <w:color w:val="auto"/>
+          <w:sz w:val="20"/>
+          <w:szCs w:val="20"/>
+        </w:rPr>
+        <w:instrText xml:space="preserve"> SEQ Slika \* ARABIC \s 1 </w:instrText>
+      </w:r>
+      <w:r>
+        <w:rPr>
+          <w:rFonts w:ascii="Times New Roman" w:hAnsi="Times New Roman" w:cs="Times New Roman"/>
+          <w:b/>
+          <w:bCs/>
+          <w:i w:val="0"/>
+          <w:iCs w:val="0"/>
+          <w:color w:val="auto"/>
+          <w:sz w:val="20"/>
+          <w:szCs w:val="20"/>
+        </w:rPr>
+        <w:fldChar w:fldCharType="separate"/>
+      </w:r>
+      <w:r>
+        <w:rPr>
+          <w:rFonts w:ascii="Times New Roman" w:hAnsi="Times New Roman" w:cs="Times New Roman"/>
+          <w:b/>
+          <w:bCs/>
+          <w:i w:val="0"/>
+          <w:iCs w:val="0"/>
+          <w:noProof/>
+          <w:color w:val="auto"/>
+          <w:sz w:val="20"/>
+          <w:szCs w:val="20"/>
+        </w:rPr>
+        <w:t>39</w:t>
+      </w:r>
+      <w:r>
+        <w:rPr>
+          <w:rFonts w:ascii="Times New Roman" w:hAnsi="Times New Roman" w:cs="Times New Roman"/>
+          <w:b/>
+          <w:bCs/>
+          <w:i w:val="0"/>
+          <w:iCs w:val="0"/>
+          <w:color w:val="auto"/>
+          <w:sz w:val="20"/>
+          <w:szCs w:val="20"/>
+        </w:rPr>
+        <w:fldChar w:fldCharType="end"/>
+      </w:r>
+      <w:r>
+        <w:rPr>
+          <w:rFonts w:ascii="Times New Roman" w:hAnsi="Times New Roman" w:cs="Times New Roman"/>
+          <w:b/>
+          <w:bCs/>
+          <w:i w:val="0"/>
+          <w:iCs w:val="0"/>
+          <w:color w:val="auto"/>
+          <w:sz w:val="20"/>
+          <w:szCs w:val="20"/>
+        </w:rPr>
+        <w:t>:</w:t>
+      </w:r>
+      <w:r>
+        <w:rPr>
+          <w:rFonts w:ascii="Times New Roman" w:hAnsi="Times New Roman" w:cs="Times New Roman"/>
+          <w:i w:val="0"/>
+          <w:iCs w:val="0"/>
+          <w:color w:val="auto"/>
+          <w:sz w:val="20"/>
+          <w:szCs w:val="20"/>
+        </w:rPr>
+        <w:t xml:space="preserve"> Kod za upravljanje unošenja priloga unutar PrilogTable komponente</w:t>
+      </w:r>
+    </w:p>
+    <w:p>
+      <w:pPr>
+        <w:spacing w:line="360" w:lineRule="auto"/>
+        <w:jc w:val="both"/>
+        <w:rPr>
+          <w:rFonts w:ascii="Times New Roman" w:hAnsi="Times New Roman" w:cs="Times New Roman"/>
+          <w:sz w:val="24"/>
+          <w:szCs w:val="24"/>
+        </w:rPr>
+      </w:pPr>
+      <w:r>
+        <w:rPr>
+          <w:rFonts w:ascii="Times New Roman" w:hAnsi="Times New Roman" w:cs="Times New Roman"/>
+          <w:sz w:val="24"/>
+          <w:szCs w:val="24"/>
+        </w:rPr>
+        <w:t xml:space="preserve">Posebne komponente kreirane su za potrebe upravljanja prikazivanja i uređivanja korisnikovih podataka na profilu. Popis korištenih komponenti prikazano je na </w:t>
+      </w:r>
+      <w:r>
+        <w:rPr>
+          <w:rFonts w:ascii="Times New Roman" w:hAnsi="Times New Roman" w:cs="Times New Roman"/>
+          <w:b/>
+          <w:bCs/>
+          <w:sz w:val="24"/>
+          <w:szCs w:val="24"/>
+        </w:rPr>
+        <w:t>slici 4.40.</w:t>
+      </w:r>
+      <w:r>
+        <w:rPr>
+          <w:rFonts w:ascii="Times New Roman" w:hAnsi="Times New Roman" w:cs="Times New Roman"/>
+          <w:b/>
+          <w:bCs/>
+          <w:sz w:val="24"/>
+          <w:szCs w:val="24"/>
+        </w:rPr>
+        <w:t>,</w:t>
+      </w:r>
+      <w:r>
+        <w:rPr>
+          <w:rFonts w:ascii="Times New Roman" w:hAnsi="Times New Roman" w:cs="Times New Roman"/>
+          <w:sz w:val="24"/>
+          <w:szCs w:val="24"/>
+        </w:rPr>
+        <w:t xml:space="preserve"> svaka od komponeti ima svoju ulogu za prikaz na stranici. „EditProfileModal“ koristi se za potrebe modala za promjenu korisnikovih podataka, dok se posebni modal „ResetPasswordModal“ koristi za promjenom korisnikove lozinke. „UserTable“ komponenta koristi se za prikaz svih korisničkih profila unutar aplikacije i vidljiva je samo admin i predlagatelj ulozi. Njima je omogućeno mijenjanje korisničkih uloga kroz posebni modal „UserRoleEditModal“.</w:t>
+      </w:r>
+    </w:p>
+    <w:p>
+      <w:pPr>
+        <w:keepNext/>
+        <w:jc w:val="center"/>
+      </w:pPr>
+      <w:r>
+        <w:rPr>
+          <w:rFonts w:ascii="Times New Roman" w:hAnsi="Times New Roman" w:cs="Times New Roman"/>
+          <w:sz w:val="24"/>
+          <w:szCs w:val="24"/>
+        </w:rPr>
+        <w:drawing>
+          <wp:inline distT="0" distB="0" distL="0" distR="0" wp14:anchorId="2F81377B" wp14:editId="150EF1BC">
+            <wp:extent cx="2237885" cy="1167439"/>
+            <wp:effectExtent l="0" t="0" r="0" b="0"/>
+            <wp:docPr id="1175735843" name="Slika 1" descr="Slika na kojoj se prikazuje tekst, Font, snimka zaslona, broj&#10;&#10;Sadržaj generiran uz AI možda nije točan."/>
+            <wp:cNvGraphicFramePr>
+              <a:graphicFrameLocks xmlns:a="http://schemas.openxmlformats.org/drawingml/2006/main" noChangeAspect="1"/>
+            </wp:cNvGraphicFramePr>
+            <a:graphic xmlns:a="http://schemas.openxmlformats.org/drawingml/2006/main">
+              <a:graphicData uri="http://schemas.openxmlformats.org/drawingml/2006/picture">
+                <pic:pic xmlns:pic="http://schemas.openxmlformats.org/drawingml/2006/picture">
+                  <pic:nvPicPr>
+                    <pic:cNvPr id="1175735843" name="Slika 1" descr="Slika na kojoj se prikazuje tekst, Font, snimka zaslona, broj&#10;&#10;Sadržaj generiran uz AI možda nije točan."/>
+                    <pic:cNvPicPr/>
+                  </pic:nvPicPr>
+                  <pic:blipFill>
+                    <a:blip r:embed="rId49"/>
+                    <a:stretch>
+                      <a:fillRect/>
+                    </a:stretch>
+                  </pic:blipFill>
+                  <pic:spPr>
+                    <a:xfrm>
+                      <a:off x="0" y="0"/>
+                      <a:ext cx="2255477" cy="1176616"/>
+                    </a:xfrm>
+                    <a:prstGeom prst="rect">
+                      <a:avLst/>
+                    </a:prstGeom>
+                  </pic:spPr>
+                </pic:pic>
+              </a:graphicData>
+            </a:graphic>
+          </wp:inline>
+        </w:drawing>
+      </w:r>
+    </w:p>
+    <w:p>
+      <w:pPr>
+        <w:pStyle w:val="Opisslike"/>
+        <w:jc w:val="center"/>
+        <w:rPr>
+          <w:rFonts w:ascii="Times New Roman" w:hAnsi="Times New Roman" w:cs="Times New Roman"/>
+          <w:i w:val="0"/>
+          <w:iCs w:val="0"/>
+          <w:color w:val="auto"/>
           <w:sz w:val="28"/>
           <w:szCs w:val="28"/>
         </w:rPr>
       </w:pPr>
       <w:r>
         <w:rPr>
-          <w:rFonts w:ascii="Times New Roman" w:hAnsi="Times New Roman" w:cs="Times New Roman"/>
           <w:b/>
           <w:bCs/>
           <w:i w:val="0"/>
@@ -21241,7 +21810,6 @@
       </w:r>
       <w:r>
         <w:rPr>
-          <w:rFonts w:ascii="Times New Roman" w:hAnsi="Times New Roman" w:cs="Times New Roman"/>
           <w:b/>
           <w:bCs/>
           <w:i w:val="0"/>
@@ -21254,7 +21822,6 @@
       </w:r>
       <w:r>
         <w:rPr>
-          <w:rFonts w:ascii="Times New Roman" w:hAnsi="Times New Roman" w:cs="Times New Roman"/>
           <w:b/>
           <w:bCs/>
           <w:i w:val="0"/>
@@ -21267,7 +21834,6 @@
       </w:r>
       <w:r>
         <w:rPr>
-          <w:rFonts w:ascii="Times New Roman" w:hAnsi="Times New Roman" w:cs="Times New Roman"/>
           <w:b/>
           <w:bCs/>
           <w:i w:val="0"/>
@@ -21280,7 +21846,6 @@
       </w:r>
       <w:r>
         <w:rPr>
-          <w:rFonts w:ascii="Times New Roman" w:hAnsi="Times New Roman" w:cs="Times New Roman"/>
           <w:b/>
           <w:bCs/>
           <w:i w:val="0"/>
@@ -21294,7 +21859,6 @@
       </w:r>
       <w:r>
         <w:rPr>
-          <w:rFonts w:ascii="Times New Roman" w:hAnsi="Times New Roman" w:cs="Times New Roman"/>
           <w:b/>
           <w:bCs/>
           <w:i w:val="0"/>
@@ -21307,7 +21871,6 @@
       </w:r>
       <w:r>
         <w:rPr>
-          <w:rFonts w:ascii="Times New Roman" w:hAnsi="Times New Roman" w:cs="Times New Roman"/>
           <w:b/>
           <w:bCs/>
           <w:i w:val="0"/>
@@ -21320,7 +21883,6 @@
       </w:r>
       <w:r>
         <w:rPr>
-          <w:rFonts w:ascii="Times New Roman" w:hAnsi="Times New Roman" w:cs="Times New Roman"/>
           <w:b/>
           <w:bCs/>
           <w:i w:val="0"/>
@@ -21333,7 +21895,6 @@
       </w:r>
       <w:r>
         <w:rPr>
-          <w:rFonts w:ascii="Times New Roman" w:hAnsi="Times New Roman" w:cs="Times New Roman"/>
           <w:b/>
           <w:bCs/>
           <w:i w:val="0"/>
@@ -21346,7 +21907,6 @@
       </w:r>
       <w:r>
         <w:rPr>
-          <w:rFonts w:ascii="Times New Roman" w:hAnsi="Times New Roman" w:cs="Times New Roman"/>
           <w:b/>
           <w:bCs/>
           <w:i w:val="0"/>
@@ -21359,7 +21919,6 @@
       </w:r>
       <w:r>
         <w:rPr>
-          <w:rFonts w:ascii="Times New Roman" w:hAnsi="Times New Roman" w:cs="Times New Roman"/>
           <w:b/>
           <w:bCs/>
           <w:i w:val="0"/>
@@ -21369,11 +21928,10 @@
           <w:sz w:val="20"/>
           <w:szCs w:val="20"/>
         </w:rPr>
-        <w:t>39</w:t>
-      </w:r>
-      <w:r>
-        <w:rPr>
-          <w:rFonts w:ascii="Times New Roman" w:hAnsi="Times New Roman" w:cs="Times New Roman"/>
+        <w:t>40</w:t>
+      </w:r>
+      <w:r>
+        <w:rPr>
           <w:b/>
           <w:bCs/>
           <w:i w:val="0"/>
@@ -21386,7 +21944,6 @@
       </w:r>
       <w:r>
         <w:rPr>
-          <w:rFonts w:ascii="Times New Roman" w:hAnsi="Times New Roman" w:cs="Times New Roman"/>
           <w:b/>
           <w:bCs/>
           <w:i w:val="0"/>
@@ -21399,14 +21956,13 @@
       </w:r>
       <w:r>
         <w:rPr>
-          <w:rFonts w:ascii="Times New Roman" w:hAnsi="Times New Roman" w:cs="Times New Roman"/>
-          <w:i w:val="0"/>
-          <w:iCs w:val="0"/>
-          <w:color w:val="auto"/>
-          <w:sz w:val="20"/>
-          <w:szCs w:val="20"/>
-        </w:rPr>
-        <w:t xml:space="preserve"> Kod za upravljanje unošenja priloga unutar PrilogTable komponente</w:t>
+          <w:i w:val="0"/>
+          <w:iCs w:val="0"/>
+          <w:color w:val="auto"/>
+          <w:sz w:val="20"/>
+          <w:szCs w:val="20"/>
+        </w:rPr>
+        <w:t xml:space="preserve"> Prikaz komponenti korištenih za korisnikov profil</w:t>
       </w:r>
     </w:p>
     <w:p>
@@ -21438,6 +21994,7 @@
           <w:sz w:val="24"/>
           <w:szCs w:val="24"/>
         </w:rPr>
+        <w:lastRenderedPageBreak/>
         <w:t>Dizajn stranice</w:t>
       </w:r>
       <w:bookmarkEnd w:id="25"/>
@@ -21476,7 +22033,27 @@
           <w:sz w:val="24"/>
           <w:szCs w:val="24"/>
         </w:rPr>
-        <w:t>slici 4.40.</w:t>
+        <w:t>slici 4.4</w:t>
+      </w:r>
+      <w:r>
+        <w:rPr>
+          <w:rFonts w:ascii="Times New Roman" w:hAnsi="Times New Roman" w:cs="Times New Roman"/>
+          <w:b/>
+          <w:bCs/>
+          <w:sz w:val="24"/>
+          <w:szCs w:val="24"/>
+        </w:rPr>
+        <w:t>1</w:t>
+      </w:r>
+      <w:r>
+        <w:rPr>
+          <w:rFonts w:ascii="Times New Roman" w:hAnsi="Times New Roman" w:cs="Times New Roman"/>
+          <w:b/>
+          <w:bCs/>
+          <w:sz w:val="24"/>
+          <w:szCs w:val="24"/>
+        </w:rPr>
+        <w:t>.</w:t>
       </w:r>
     </w:p>
     <w:p>
@@ -21493,7 +22070,6 @@
           <w:rFonts w:ascii="Times New Roman" w:hAnsi="Times New Roman" w:cs="Times New Roman"/>
           <w:noProof/>
         </w:rPr>
-        <w:lastRenderedPageBreak/>
         <w:drawing>
           <wp:inline distT="0" distB="0" distL="0" distR="0" wp14:anchorId="626FF7F4" wp14:editId="250515FF">
             <wp:extent cx="2514951" cy="1962424"/>
@@ -21510,7 +22086,7 @@
                     <pic:cNvPicPr/>
                   </pic:nvPicPr>
                   <pic:blipFill>
-                    <a:blip r:embed="rId49"/>
+                    <a:blip r:embed="rId50"/>
                     <a:stretch>
                       <a:fillRect/>
                     </a:stretch>
@@ -21687,7 +22263,7 @@
           <w:sz w:val="20"/>
           <w:szCs w:val="20"/>
         </w:rPr>
-        <w:t>40</w:t>
+        <w:t>41</w:t>
       </w:r>
       <w:r>
         <w:rPr>
@@ -22044,16 +22620,16 @@
           <w:szCs w:val="24"/>
         </w:rPr>
         <w:drawing>
-          <wp:anchor distT="0" distB="0" distL="114300" distR="114300" simplePos="0" relativeHeight="251668480" behindDoc="0" locked="0" layoutInCell="1" allowOverlap="1" wp14:anchorId="638073AC" wp14:editId="6E794CB5">
+          <wp:anchor distT="0" distB="0" distL="114300" distR="114300" simplePos="0" relativeHeight="251668480" behindDoc="0" locked="0" layoutInCell="1" allowOverlap="1" wp14:anchorId="638073AC" wp14:editId="2916C500">
             <wp:simplePos x="0" y="0"/>
             <wp:positionH relativeFrom="column">
-              <wp:posOffset>3002622</wp:posOffset>
+              <wp:posOffset>2933401</wp:posOffset>
             </wp:positionH>
             <wp:positionV relativeFrom="paragraph">
-              <wp:posOffset>353060</wp:posOffset>
+              <wp:posOffset>3176</wp:posOffset>
             </wp:positionV>
-            <wp:extent cx="2889739" cy="1756091"/>
-            <wp:effectExtent l="0" t="0" r="6350" b="0"/>
+            <wp:extent cx="2161151" cy="1313329"/>
+            <wp:effectExtent l="0" t="0" r="0" b="1270"/>
             <wp:wrapNone/>
             <wp:docPr id="457634984" name="Slika 1" descr="Slika na kojoj se prikazuje tekst, snimka zaslona, Font&#10;&#10;Sadržaj generiran uz AI možda nije točan."/>
             <wp:cNvGraphicFramePr>
@@ -22067,7 +22643,7 @@
                     <pic:cNvPicPr/>
                   </pic:nvPicPr>
                   <pic:blipFill>
-                    <a:blip r:embed="rId50">
+                    <a:blip r:embed="rId51">
                       <a:extLst>
                         <a:ext uri="{28A0092B-C50C-407E-A947-70E740481C1C}">
                           <a14:useLocalDpi xmlns:a14="http://schemas.microsoft.com/office/drawing/2010/main" val="0"/>
@@ -22081,7 +22657,7 @@
                   <pic:spPr>
                     <a:xfrm>
                       <a:off x="0" y="0"/>
-                      <a:ext cx="2889739" cy="1756091"/>
+                      <a:ext cx="2161151" cy="1313329"/>
                     </a:xfrm>
                     <a:prstGeom prst="rect">
                       <a:avLst/>
@@ -22099,11 +22675,14 @@
           </wp:anchor>
         </w:drawing>
       </w:r>
-    </w:p>
-    <w:p>
-      <w:pPr>
-        <w:keepNext/>
-      </w:pPr>
+      <w:r>
+        <w:rPr>
+          <w:rFonts w:ascii="Times New Roman" w:hAnsi="Times New Roman" w:cs="Times New Roman"/>
+          <w:sz w:val="24"/>
+          <w:szCs w:val="24"/>
+        </w:rPr>
+        <w:t xml:space="preserve">             </w:t>
+      </w:r>
       <w:r>
         <w:rPr>
           <w:rFonts w:ascii="Times New Roman" w:hAnsi="Times New Roman" w:cs="Times New Roman"/>
@@ -22112,9 +22691,9 @@
           <w:szCs w:val="24"/>
         </w:rPr>
         <w:drawing>
-          <wp:inline distT="0" distB="0" distL="0" distR="0" wp14:anchorId="2D2D4712" wp14:editId="23D4D1E6">
-            <wp:extent cx="2878015" cy="1747364"/>
-            <wp:effectExtent l="0" t="0" r="0" b="5715"/>
+          <wp:inline distT="0" distB="0" distL="0" distR="0" wp14:anchorId="1185BF48" wp14:editId="1DBC5906">
+            <wp:extent cx="2213002" cy="1313815"/>
+            <wp:effectExtent l="0" t="0" r="0" b="635"/>
             <wp:docPr id="1042371987" name="Slika 1" descr="Slika na kojoj se prikazuje tekst, snimka zaslona, Font&#10;&#10;Sadržaj generiran uz AI možda nije točan."/>
             <wp:cNvGraphicFramePr>
               <a:graphicFrameLocks xmlns:a="http://schemas.openxmlformats.org/drawingml/2006/main" noChangeAspect="1"/>
@@ -22127,7 +22706,7 @@
                     <pic:cNvPicPr/>
                   </pic:nvPicPr>
                   <pic:blipFill>
-                    <a:blip r:embed="rId51"/>
+                    <a:blip r:embed="rId52"/>
                     <a:stretch>
                       <a:fillRect/>
                     </a:stretch>
@@ -22135,7 +22714,7 @@
                   <pic:spPr>
                     <a:xfrm>
                       <a:off x="0" y="0"/>
-                      <a:ext cx="2917572" cy="1771381"/>
+                      <a:ext cx="2274853" cy="1350535"/>
                     </a:xfrm>
                     <a:prstGeom prst="rect">
                       <a:avLst/>
@@ -22304,7 +22883,7 @@
           <w:sz w:val="20"/>
           <w:szCs w:val="20"/>
         </w:rPr>
-        <w:t>41</w:t>
+        <w:t>42</w:t>
       </w:r>
       <w:r>
         <w:rPr>
@@ -22342,23 +22921,6 @@
           <w:szCs w:val="20"/>
         </w:rPr>
         <w:t xml:space="preserve"> Korištene boje unutar aplikacije</w:t>
-      </w:r>
-    </w:p>
-    <w:p>
-      <w:pPr>
-        <w:rPr>
-          <w:rFonts w:ascii="Times New Roman" w:hAnsi="Times New Roman" w:cs="Times New Roman"/>
-          <w:sz w:val="24"/>
-          <w:szCs w:val="24"/>
-        </w:rPr>
-      </w:pPr>
-      <w:r>
-        <w:rPr>
-          <w:rFonts w:ascii="Times New Roman" w:hAnsi="Times New Roman" w:cs="Times New Roman"/>
-          <w:sz w:val="24"/>
-          <w:szCs w:val="24"/>
-        </w:rPr>
-        <w:br w:type="page"/>
       </w:r>
     </w:p>
     <w:p>
@@ -22529,7 +23091,7 @@
                     <pic:cNvPicPr/>
                   </pic:nvPicPr>
                   <pic:blipFill>
-                    <a:blip r:embed="rId52"/>
+                    <a:blip r:embed="rId53"/>
                     <a:stretch>
                       <a:fillRect/>
                     </a:stretch>
@@ -22875,7 +23437,7 @@
                     <pic:cNvPicPr/>
                   </pic:nvPicPr>
                   <pic:blipFill>
-                    <a:blip r:embed="rId53"/>
+                    <a:blip r:embed="rId54"/>
                     <a:stretch>
                       <a:fillRect/>
                     </a:stretch>
@@ -23233,7 +23795,7 @@
                     <pic:cNvPicPr/>
                   </pic:nvPicPr>
                   <pic:blipFill>
-                    <a:blip r:embed="rId54"/>
+                    <a:blip r:embed="rId55"/>
                     <a:stretch>
                       <a:fillRect/>
                     </a:stretch>
@@ -23485,7 +24047,7 @@
           <w:szCs w:val="28"/>
         </w:rPr>
         <w:drawing>
-          <wp:anchor distT="0" distB="0" distL="114300" distR="114300" simplePos="0" relativeHeight="251669504" behindDoc="0" locked="0" layoutInCell="1" allowOverlap="1" wp14:anchorId="52197FD6" wp14:editId="2FACAA4C">
+          <wp:anchor distT="0" distB="0" distL="114300" distR="114300" simplePos="0" relativeHeight="251669504" behindDoc="0" locked="0" layoutInCell="1" allowOverlap="1" wp14:anchorId="52197FD6" wp14:editId="7E215F40">
             <wp:simplePos x="0" y="0"/>
             <wp:positionH relativeFrom="column">
               <wp:posOffset>56125</wp:posOffset>
@@ -23508,7 +24070,7 @@
                     <pic:cNvPicPr/>
                   </pic:nvPicPr>
                   <pic:blipFill>
-                    <a:blip r:embed="rId55" cstate="print">
+                    <a:blip r:embed="rId56" cstate="print">
                       <a:extLst>
                         <a:ext uri="{28A0092B-C50C-407E-A947-70E740481C1C}">
                           <a14:useLocalDpi xmlns:a14="http://schemas.microsoft.com/office/drawing/2010/main" val="0"/>
@@ -23949,7 +24511,31 @@
           <w:sz w:val="24"/>
           <w:szCs w:val="24"/>
         </w:rPr>
-        <w:t xml:space="preserve"> uloge i ostalih prikazane su na </w:t>
+        <w:t xml:space="preserve"> i predlagatelj</w:t>
+      </w:r>
+      <w:r>
+        <w:rPr>
+          <w:rFonts w:ascii="Times New Roman" w:hAnsi="Times New Roman" w:cs="Times New Roman"/>
+          <w:sz w:val="24"/>
+          <w:szCs w:val="24"/>
+        </w:rPr>
+        <w:t xml:space="preserve"> ulog</w:t>
+      </w:r>
+      <w:r>
+        <w:rPr>
+          <w:rFonts w:ascii="Times New Roman" w:hAnsi="Times New Roman" w:cs="Times New Roman"/>
+          <w:sz w:val="24"/>
+          <w:szCs w:val="24"/>
+        </w:rPr>
+        <w:t>a</w:t>
+      </w:r>
+      <w:r>
+        <w:rPr>
+          <w:rFonts w:ascii="Times New Roman" w:hAnsi="Times New Roman" w:cs="Times New Roman"/>
+          <w:sz w:val="24"/>
+          <w:szCs w:val="24"/>
+        </w:rPr>
+        <w:t xml:space="preserve"> i ostalih prikazane su na </w:t>
       </w:r>
       <w:r>
         <w:rPr>
@@ -24016,6 +24602,14 @@
           <w:szCs w:val="24"/>
         </w:rPr>
         <w:t>Nakon prijave korisnikovo ime prikazano je u desnom rubu navigacijske trake kao i gumb za odjavu.</w:t>
+      </w:r>
+      <w:r>
+        <w:rPr>
+          <w:rFonts w:ascii="Times New Roman" w:hAnsi="Times New Roman" w:cs="Times New Roman"/>
+          <w:sz w:val="24"/>
+          <w:szCs w:val="24"/>
+        </w:rPr>
+        <w:t xml:space="preserve"> </w:t>
       </w:r>
     </w:p>
     <w:p>
@@ -24050,7 +24644,7 @@
                     <pic:cNvPicPr/>
                   </pic:nvPicPr>
                   <pic:blipFill>
-                    <a:blip r:embed="rId56"/>
+                    <a:blip r:embed="rId57"/>
                     <a:stretch>
                       <a:fillRect/>
                     </a:stretch>
@@ -24349,7 +24943,7 @@
                     <pic:cNvPicPr/>
                   </pic:nvPicPr>
                   <pic:blipFill>
-                    <a:blip r:embed="rId57"/>
+                    <a:blip r:embed="rId58"/>
                     <a:stretch>
                       <a:fillRect/>
                     </a:stretch>
@@ -24378,6 +24972,7 @@
     <w:p>
       <w:pPr>
         <w:pStyle w:val="Opisslike"/>
+        <w:spacing w:line="360" w:lineRule="auto"/>
         <w:jc w:val="center"/>
         <w:rPr>
           <w:rFonts w:ascii="Times New Roman" w:hAnsi="Times New Roman" w:cs="Times New Roman"/>
@@ -24573,38 +25168,609 @@
     </w:p>
     <w:p>
       <w:pPr>
-        <w:rPr>
-          <w:rFonts w:ascii="Times New Roman" w:hAnsi="Times New Roman" w:cs="Times New Roman"/>
-        </w:rPr>
-      </w:pPr>
+        <w:spacing w:line="360" w:lineRule="auto"/>
+        <w:jc w:val="both"/>
+        <w:rPr>
+          <w:rFonts w:ascii="Times New Roman" w:hAnsi="Times New Roman" w:cs="Times New Roman"/>
+          <w:sz w:val="24"/>
+          <w:szCs w:val="24"/>
+        </w:rPr>
+      </w:pPr>
+      <w:r>
+        <w:rPr>
+          <w:rFonts w:ascii="Times New Roman" w:hAnsi="Times New Roman" w:cs="Times New Roman"/>
+          <w:sz w:val="24"/>
+          <w:szCs w:val="24"/>
+        </w:rPr>
+        <w:t xml:space="preserve">Pritiskom na korisničko ime otvara se stranica sa korisnikovim profilom. Korisniku je omogućeno uređivanje svojih osobnih podataka kao i ažuriranje trenutne lozinke, prikazano na </w:t>
+      </w:r>
+      <w:r>
+        <w:rPr>
+          <w:rFonts w:ascii="Times New Roman" w:hAnsi="Times New Roman" w:cs="Times New Roman"/>
+          <w:b/>
+          <w:bCs/>
+          <w:sz w:val="24"/>
+          <w:szCs w:val="24"/>
+        </w:rPr>
+        <w:t>slici 5.</w:t>
+      </w:r>
+      <w:r>
+        <w:rPr>
+          <w:rFonts w:ascii="Times New Roman" w:hAnsi="Times New Roman" w:cs="Times New Roman"/>
+          <w:b/>
+          <w:bCs/>
+          <w:sz w:val="24"/>
+          <w:szCs w:val="24"/>
+        </w:rPr>
+        <w:t>7.</w:t>
+      </w:r>
+      <w:r>
+        <w:rPr>
+          <w:rFonts w:ascii="Times New Roman" w:hAnsi="Times New Roman" w:cs="Times New Roman"/>
+          <w:b/>
+          <w:bCs/>
+          <w:sz w:val="24"/>
+          <w:szCs w:val="24"/>
+        </w:rPr>
+        <w:t xml:space="preserve"> </w:t>
+      </w:r>
+      <w:r>
+        <w:rPr>
+          <w:rFonts w:ascii="Times New Roman" w:hAnsi="Times New Roman" w:cs="Times New Roman"/>
+          <w:sz w:val="24"/>
+          <w:szCs w:val="24"/>
+        </w:rPr>
+        <w:t xml:space="preserve">Pritiskom na gumb „Uredi profil“ korisniku se otvara modalnih prozor čiju formu može uređivati te spremiti promjene, prikazano na </w:t>
+      </w:r>
+      <w:r>
+        <w:rPr>
+          <w:rFonts w:ascii="Times New Roman" w:hAnsi="Times New Roman" w:cs="Times New Roman"/>
+          <w:b/>
+          <w:bCs/>
+          <w:sz w:val="24"/>
+          <w:szCs w:val="24"/>
+        </w:rPr>
+        <w:t>slici 5.8.</w:t>
+      </w:r>
+      <w:r>
+        <w:rPr>
+          <w:rFonts w:ascii="Times New Roman" w:hAnsi="Times New Roman" w:cs="Times New Roman"/>
+          <w:sz w:val="24"/>
+          <w:szCs w:val="24"/>
+        </w:rPr>
+        <w:t xml:space="preserve"> Dok ukoliko je korisnikova uloga admin omogućen mu je prikaz svih korisničkih računa na stranici prikazano na </w:t>
+      </w:r>
+      <w:r>
+        <w:rPr>
+          <w:rFonts w:ascii="Times New Roman" w:hAnsi="Times New Roman" w:cs="Times New Roman"/>
+          <w:b/>
+          <w:bCs/>
+          <w:sz w:val="24"/>
+          <w:szCs w:val="24"/>
+        </w:rPr>
+        <w:t>slici 5.9.</w:t>
+      </w:r>
+      <w:r>
+        <w:rPr>
+          <w:rFonts w:ascii="Times New Roman" w:hAnsi="Times New Roman" w:cs="Times New Roman"/>
+          <w:sz w:val="24"/>
+          <w:szCs w:val="24"/>
+        </w:rPr>
+        <w:t xml:space="preserve"> </w:t>
+      </w:r>
     </w:p>
     <w:p>
       <w:pPr>
+        <w:keepNext/>
+        <w:spacing w:line="360" w:lineRule="auto"/>
+        <w:jc w:val="center"/>
+      </w:pPr>
+      <w:r>
+        <w:rPr>
+          <w:rFonts w:ascii="Times New Roman" w:hAnsi="Times New Roman" w:cs="Times New Roman"/>
+          <w:sz w:val="24"/>
+          <w:szCs w:val="24"/>
+        </w:rPr>
+        <w:lastRenderedPageBreak/>
+        <w:drawing>
+          <wp:inline distT="0" distB="0" distL="0" distR="0" wp14:anchorId="37C502E5" wp14:editId="74B0E175">
+            <wp:extent cx="5440295" cy="2514261"/>
+            <wp:effectExtent l="0" t="0" r="8255" b="635"/>
+            <wp:docPr id="1826160527" name="Slika 1" descr="Slika na kojoj se prikazuje tekst, softver, Ikona na računalu, broj&#10;&#10;Sadržaj generiran uz AI možda nije točan."/>
+            <wp:cNvGraphicFramePr>
+              <a:graphicFrameLocks xmlns:a="http://schemas.openxmlformats.org/drawingml/2006/main" noChangeAspect="1"/>
+            </wp:cNvGraphicFramePr>
+            <a:graphic xmlns:a="http://schemas.openxmlformats.org/drawingml/2006/main">
+              <a:graphicData uri="http://schemas.openxmlformats.org/drawingml/2006/picture">
+                <pic:pic xmlns:pic="http://schemas.openxmlformats.org/drawingml/2006/picture">
+                  <pic:nvPicPr>
+                    <pic:cNvPr id="1826160527" name="Slika 1" descr="Slika na kojoj se prikazuje tekst, softver, Ikona na računalu, broj&#10;&#10;Sadržaj generiran uz AI možda nije točan."/>
+                    <pic:cNvPicPr/>
+                  </pic:nvPicPr>
+                  <pic:blipFill>
+                    <a:blip r:embed="rId59"/>
+                    <a:stretch>
+                      <a:fillRect/>
+                    </a:stretch>
+                  </pic:blipFill>
+                  <pic:spPr>
+                    <a:xfrm>
+                      <a:off x="0" y="0"/>
+                      <a:ext cx="5449016" cy="2518291"/>
+                    </a:xfrm>
+                    <a:prstGeom prst="rect">
+                      <a:avLst/>
+                    </a:prstGeom>
+                  </pic:spPr>
+                </pic:pic>
+              </a:graphicData>
+            </a:graphic>
+          </wp:inline>
+        </w:drawing>
+      </w:r>
+    </w:p>
+    <w:p>
+      <w:pPr>
+        <w:pStyle w:val="Opisslike"/>
+        <w:spacing w:line="360" w:lineRule="auto"/>
+        <w:jc w:val="center"/>
+        <w:rPr>
+          <w:rFonts w:ascii="Times New Roman" w:hAnsi="Times New Roman" w:cs="Times New Roman"/>
+          <w:i w:val="0"/>
+          <w:iCs w:val="0"/>
+          <w:color w:val="auto"/>
+          <w:sz w:val="20"/>
+          <w:szCs w:val="20"/>
+        </w:rPr>
+      </w:pPr>
+      <w:r>
+        <w:rPr>
+          <w:rFonts w:ascii="Times New Roman" w:hAnsi="Times New Roman" w:cs="Times New Roman"/>
+          <w:b/>
+          <w:bCs/>
+          <w:i w:val="0"/>
+          <w:iCs w:val="0"/>
+          <w:color w:val="auto"/>
+          <w:sz w:val="20"/>
+          <w:szCs w:val="20"/>
+        </w:rPr>
+        <w:t xml:space="preserve">Slika </w:t>
+      </w:r>
+      <w:r>
+        <w:rPr>
+          <w:rFonts w:ascii="Times New Roman" w:hAnsi="Times New Roman" w:cs="Times New Roman"/>
+          <w:b/>
+          <w:bCs/>
+          <w:i w:val="0"/>
+          <w:iCs w:val="0"/>
+          <w:color w:val="auto"/>
+          <w:sz w:val="20"/>
+          <w:szCs w:val="20"/>
+        </w:rPr>
+        <w:fldChar w:fldCharType="begin"/>
+      </w:r>
+      <w:r>
+        <w:rPr>
+          <w:rFonts w:ascii="Times New Roman" w:hAnsi="Times New Roman" w:cs="Times New Roman"/>
+          <w:b/>
+          <w:bCs/>
+          <w:i w:val="0"/>
+          <w:iCs w:val="0"/>
+          <w:color w:val="auto"/>
+          <w:sz w:val="20"/>
+          <w:szCs w:val="20"/>
+        </w:rPr>
+        <w:instrText xml:space="preserve"> STYLEREF 1 \s </w:instrText>
+      </w:r>
+      <w:r>
+        <w:rPr>
+          <w:rFonts w:ascii="Times New Roman" w:hAnsi="Times New Roman" w:cs="Times New Roman"/>
+          <w:b/>
+          <w:bCs/>
+          <w:i w:val="0"/>
+          <w:iCs w:val="0"/>
+          <w:color w:val="auto"/>
+          <w:sz w:val="20"/>
+          <w:szCs w:val="20"/>
+        </w:rPr>
+        <w:fldChar w:fldCharType="separate"/>
+      </w:r>
+      <w:r>
+        <w:rPr>
+          <w:rFonts w:ascii="Times New Roman" w:hAnsi="Times New Roman" w:cs="Times New Roman"/>
+          <w:b/>
+          <w:bCs/>
+          <w:i w:val="0"/>
+          <w:iCs w:val="0"/>
+          <w:noProof/>
+          <w:color w:val="auto"/>
+          <w:sz w:val="20"/>
+          <w:szCs w:val="20"/>
+        </w:rPr>
+        <w:t>5</w:t>
+      </w:r>
+      <w:r>
+        <w:rPr>
+          <w:rFonts w:ascii="Times New Roman" w:hAnsi="Times New Roman" w:cs="Times New Roman"/>
+          <w:b/>
+          <w:bCs/>
+          <w:i w:val="0"/>
+          <w:iCs w:val="0"/>
+          <w:color w:val="auto"/>
+          <w:sz w:val="20"/>
+          <w:szCs w:val="20"/>
+        </w:rPr>
+        <w:fldChar w:fldCharType="end"/>
+      </w:r>
+      <w:r>
+        <w:rPr>
+          <w:rFonts w:ascii="Times New Roman" w:hAnsi="Times New Roman" w:cs="Times New Roman"/>
+          <w:b/>
+          <w:bCs/>
+          <w:i w:val="0"/>
+          <w:iCs w:val="0"/>
+          <w:color w:val="auto"/>
+          <w:sz w:val="20"/>
+          <w:szCs w:val="20"/>
+        </w:rPr>
+        <w:t>.</w:t>
+      </w:r>
+      <w:r>
+        <w:rPr>
+          <w:rFonts w:ascii="Times New Roman" w:hAnsi="Times New Roman" w:cs="Times New Roman"/>
+          <w:b/>
+          <w:bCs/>
+          <w:i w:val="0"/>
+          <w:iCs w:val="0"/>
+          <w:color w:val="auto"/>
+          <w:sz w:val="20"/>
+          <w:szCs w:val="20"/>
+        </w:rPr>
+        <w:fldChar w:fldCharType="begin"/>
+      </w:r>
+      <w:r>
+        <w:rPr>
+          <w:rFonts w:ascii="Times New Roman" w:hAnsi="Times New Roman" w:cs="Times New Roman"/>
+          <w:b/>
+          <w:bCs/>
+          <w:i w:val="0"/>
+          <w:iCs w:val="0"/>
+          <w:color w:val="auto"/>
+          <w:sz w:val="20"/>
+          <w:szCs w:val="20"/>
+        </w:rPr>
+        <w:instrText xml:space="preserve"> SEQ Slika \* ARABIC \s 1 </w:instrText>
+      </w:r>
+      <w:r>
+        <w:rPr>
+          <w:rFonts w:ascii="Times New Roman" w:hAnsi="Times New Roman" w:cs="Times New Roman"/>
+          <w:b/>
+          <w:bCs/>
+          <w:i w:val="0"/>
+          <w:iCs w:val="0"/>
+          <w:color w:val="auto"/>
+          <w:sz w:val="20"/>
+          <w:szCs w:val="20"/>
+        </w:rPr>
+        <w:fldChar w:fldCharType="separate"/>
+      </w:r>
+      <w:r>
+        <w:rPr>
+          <w:rFonts w:ascii="Times New Roman" w:hAnsi="Times New Roman" w:cs="Times New Roman"/>
+          <w:b/>
+          <w:bCs/>
+          <w:i w:val="0"/>
+          <w:iCs w:val="0"/>
+          <w:noProof/>
+          <w:color w:val="auto"/>
+          <w:sz w:val="20"/>
+          <w:szCs w:val="20"/>
+        </w:rPr>
+        <w:t>7</w:t>
+      </w:r>
+      <w:r>
+        <w:rPr>
+          <w:rFonts w:ascii="Times New Roman" w:hAnsi="Times New Roman" w:cs="Times New Roman"/>
+          <w:b/>
+          <w:bCs/>
+          <w:i w:val="0"/>
+          <w:iCs w:val="0"/>
+          <w:color w:val="auto"/>
+          <w:sz w:val="20"/>
+          <w:szCs w:val="20"/>
+        </w:rPr>
+        <w:fldChar w:fldCharType="end"/>
+      </w:r>
+      <w:r>
+        <w:rPr>
+          <w:rFonts w:ascii="Times New Roman" w:hAnsi="Times New Roman" w:cs="Times New Roman"/>
+          <w:b/>
+          <w:bCs/>
+          <w:i w:val="0"/>
+          <w:iCs w:val="0"/>
+          <w:color w:val="auto"/>
+          <w:sz w:val="20"/>
+          <w:szCs w:val="20"/>
+        </w:rPr>
+        <w:t>:</w:t>
+      </w:r>
+      <w:r>
+        <w:rPr>
+          <w:rFonts w:ascii="Times New Roman" w:hAnsi="Times New Roman" w:cs="Times New Roman"/>
+          <w:i w:val="0"/>
+          <w:iCs w:val="0"/>
+          <w:color w:val="auto"/>
+          <w:sz w:val="20"/>
+          <w:szCs w:val="20"/>
+        </w:rPr>
+        <w:t xml:space="preserve"> Prikaz stranice za korisnikov profil</w:t>
+      </w:r>
+    </w:p>
+    <w:p>
+      <w:pPr>
+        <w:keepNext/>
+        <w:jc w:val="center"/>
+      </w:pPr>
+      <w:r>
+        <w:drawing>
+          <wp:inline distT="0" distB="0" distL="0" distR="0" wp14:anchorId="078912AB" wp14:editId="7985596A">
+            <wp:extent cx="5555556" cy="3989381"/>
+            <wp:effectExtent l="0" t="0" r="7620" b="0"/>
+            <wp:docPr id="686923623" name="Slika 1" descr="Slika na kojoj se prikazuje tekst, snimka zaslona, softver, Multimedijski softver&#10;&#10;Sadržaj generiran uz AI možda nije točan."/>
+            <wp:cNvGraphicFramePr>
+              <a:graphicFrameLocks xmlns:a="http://schemas.openxmlformats.org/drawingml/2006/main" noChangeAspect="1"/>
+            </wp:cNvGraphicFramePr>
+            <a:graphic xmlns:a="http://schemas.openxmlformats.org/drawingml/2006/main">
+              <a:graphicData uri="http://schemas.openxmlformats.org/drawingml/2006/picture">
+                <pic:pic xmlns:pic="http://schemas.openxmlformats.org/drawingml/2006/picture">
+                  <pic:nvPicPr>
+                    <pic:cNvPr id="686923623" name="Slika 1" descr="Slika na kojoj se prikazuje tekst, snimka zaslona, softver, Multimedijski softver&#10;&#10;Sadržaj generiran uz AI možda nije točan."/>
+                    <pic:cNvPicPr/>
+                  </pic:nvPicPr>
+                  <pic:blipFill>
+                    <a:blip r:embed="rId60"/>
+                    <a:stretch>
+                      <a:fillRect/>
+                    </a:stretch>
+                  </pic:blipFill>
+                  <pic:spPr>
+                    <a:xfrm>
+                      <a:off x="0" y="0"/>
+                      <a:ext cx="5563102" cy="3994800"/>
+                    </a:xfrm>
+                    <a:prstGeom prst="rect">
+                      <a:avLst/>
+                    </a:prstGeom>
+                  </pic:spPr>
+                </pic:pic>
+              </a:graphicData>
+            </a:graphic>
+          </wp:inline>
+        </w:drawing>
+      </w:r>
+    </w:p>
+    <w:p>
+      <w:pPr>
+        <w:pStyle w:val="Opisslike"/>
+        <w:spacing w:line="360" w:lineRule="auto"/>
+        <w:jc w:val="center"/>
+        <w:rPr>
+          <w:rFonts w:ascii="Times New Roman" w:hAnsi="Times New Roman" w:cs="Times New Roman"/>
+          <w:i w:val="0"/>
+          <w:iCs w:val="0"/>
+          <w:color w:val="auto"/>
+          <w:sz w:val="20"/>
+          <w:szCs w:val="20"/>
+        </w:rPr>
+      </w:pPr>
+      <w:r>
+        <w:rPr>
+          <w:rFonts w:ascii="Times New Roman" w:hAnsi="Times New Roman" w:cs="Times New Roman"/>
+          <w:b/>
+          <w:bCs/>
+          <w:i w:val="0"/>
+          <w:iCs w:val="0"/>
+          <w:color w:val="auto"/>
+          <w:sz w:val="20"/>
+          <w:szCs w:val="20"/>
+        </w:rPr>
+        <w:t xml:space="preserve">Slika </w:t>
+      </w:r>
+      <w:r>
+        <w:rPr>
+          <w:rFonts w:ascii="Times New Roman" w:hAnsi="Times New Roman" w:cs="Times New Roman"/>
+          <w:b/>
+          <w:bCs/>
+          <w:i w:val="0"/>
+          <w:iCs w:val="0"/>
+          <w:color w:val="auto"/>
+          <w:sz w:val="20"/>
+          <w:szCs w:val="20"/>
+        </w:rPr>
+        <w:fldChar w:fldCharType="begin"/>
+      </w:r>
+      <w:r>
+        <w:rPr>
+          <w:rFonts w:ascii="Times New Roman" w:hAnsi="Times New Roman" w:cs="Times New Roman"/>
+          <w:b/>
+          <w:bCs/>
+          <w:i w:val="0"/>
+          <w:iCs w:val="0"/>
+          <w:color w:val="auto"/>
+          <w:sz w:val="20"/>
+          <w:szCs w:val="20"/>
+        </w:rPr>
+        <w:instrText xml:space="preserve"> STYLEREF 1 \s </w:instrText>
+      </w:r>
+      <w:r>
+        <w:rPr>
+          <w:rFonts w:ascii="Times New Roman" w:hAnsi="Times New Roman" w:cs="Times New Roman"/>
+          <w:b/>
+          <w:bCs/>
+          <w:i w:val="0"/>
+          <w:iCs w:val="0"/>
+          <w:color w:val="auto"/>
+          <w:sz w:val="20"/>
+          <w:szCs w:val="20"/>
+        </w:rPr>
+        <w:fldChar w:fldCharType="separate"/>
+      </w:r>
+      <w:r>
+        <w:rPr>
+          <w:rFonts w:ascii="Times New Roman" w:hAnsi="Times New Roman" w:cs="Times New Roman"/>
+          <w:b/>
+          <w:bCs/>
+          <w:i w:val="0"/>
+          <w:iCs w:val="0"/>
+          <w:noProof/>
+          <w:color w:val="auto"/>
+          <w:sz w:val="20"/>
+          <w:szCs w:val="20"/>
+        </w:rPr>
+        <w:t>5</w:t>
+      </w:r>
+      <w:r>
+        <w:rPr>
+          <w:rFonts w:ascii="Times New Roman" w:hAnsi="Times New Roman" w:cs="Times New Roman"/>
+          <w:b/>
+          <w:bCs/>
+          <w:i w:val="0"/>
+          <w:iCs w:val="0"/>
+          <w:color w:val="auto"/>
+          <w:sz w:val="20"/>
+          <w:szCs w:val="20"/>
+        </w:rPr>
+        <w:fldChar w:fldCharType="end"/>
+      </w:r>
+      <w:r>
+        <w:rPr>
+          <w:rFonts w:ascii="Times New Roman" w:hAnsi="Times New Roman" w:cs="Times New Roman"/>
+          <w:b/>
+          <w:bCs/>
+          <w:i w:val="0"/>
+          <w:iCs w:val="0"/>
+          <w:color w:val="auto"/>
+          <w:sz w:val="20"/>
+          <w:szCs w:val="20"/>
+        </w:rPr>
+        <w:t>.</w:t>
+      </w:r>
+      <w:r>
+        <w:rPr>
+          <w:rFonts w:ascii="Times New Roman" w:hAnsi="Times New Roman" w:cs="Times New Roman"/>
+          <w:b/>
+          <w:bCs/>
+          <w:i w:val="0"/>
+          <w:iCs w:val="0"/>
+          <w:color w:val="auto"/>
+          <w:sz w:val="20"/>
+          <w:szCs w:val="20"/>
+        </w:rPr>
+        <w:fldChar w:fldCharType="begin"/>
+      </w:r>
+      <w:r>
+        <w:rPr>
+          <w:rFonts w:ascii="Times New Roman" w:hAnsi="Times New Roman" w:cs="Times New Roman"/>
+          <w:b/>
+          <w:bCs/>
+          <w:i w:val="0"/>
+          <w:iCs w:val="0"/>
+          <w:color w:val="auto"/>
+          <w:sz w:val="20"/>
+          <w:szCs w:val="20"/>
+        </w:rPr>
+        <w:instrText xml:space="preserve"> SEQ Slika \* ARABIC \s 1 </w:instrText>
+      </w:r>
+      <w:r>
+        <w:rPr>
+          <w:rFonts w:ascii="Times New Roman" w:hAnsi="Times New Roman" w:cs="Times New Roman"/>
+          <w:b/>
+          <w:bCs/>
+          <w:i w:val="0"/>
+          <w:iCs w:val="0"/>
+          <w:color w:val="auto"/>
+          <w:sz w:val="20"/>
+          <w:szCs w:val="20"/>
+        </w:rPr>
+        <w:fldChar w:fldCharType="separate"/>
+      </w:r>
+      <w:r>
+        <w:rPr>
+          <w:rFonts w:ascii="Times New Roman" w:hAnsi="Times New Roman" w:cs="Times New Roman"/>
+          <w:b/>
+          <w:bCs/>
+          <w:i w:val="0"/>
+          <w:iCs w:val="0"/>
+          <w:noProof/>
+          <w:color w:val="auto"/>
+          <w:sz w:val="20"/>
+          <w:szCs w:val="20"/>
+        </w:rPr>
+        <w:t>8</w:t>
+      </w:r>
+      <w:r>
+        <w:rPr>
+          <w:rFonts w:ascii="Times New Roman" w:hAnsi="Times New Roman" w:cs="Times New Roman"/>
+          <w:b/>
+          <w:bCs/>
+          <w:i w:val="0"/>
+          <w:iCs w:val="0"/>
+          <w:color w:val="auto"/>
+          <w:sz w:val="20"/>
+          <w:szCs w:val="20"/>
+        </w:rPr>
+        <w:fldChar w:fldCharType="end"/>
+      </w:r>
+      <w:r>
+        <w:rPr>
+          <w:rFonts w:ascii="Times New Roman" w:hAnsi="Times New Roman" w:cs="Times New Roman"/>
+          <w:b/>
+          <w:bCs/>
+          <w:i w:val="0"/>
+          <w:iCs w:val="0"/>
+          <w:color w:val="auto"/>
+          <w:sz w:val="20"/>
+          <w:szCs w:val="20"/>
+        </w:rPr>
+        <w:t>:</w:t>
+      </w:r>
+      <w:r>
+        <w:rPr>
+          <w:rFonts w:ascii="Times New Roman" w:hAnsi="Times New Roman" w:cs="Times New Roman"/>
+          <w:i w:val="0"/>
+          <w:iCs w:val="0"/>
+          <w:color w:val="auto"/>
+          <w:sz w:val="20"/>
+          <w:szCs w:val="20"/>
+        </w:rPr>
+        <w:t xml:space="preserve"> Prikaz modalnog prozora za uređivanje podataka profila</w:t>
+      </w:r>
+    </w:p>
+    <w:p>
+      <w:pPr>
         <w:spacing w:line="360" w:lineRule="auto"/>
         <w:jc w:val="both"/>
         <w:rPr>
           <w:rFonts w:ascii="Times New Roman" w:hAnsi="Times New Roman" w:cs="Times New Roman"/>
-          <w:b/>
-          <w:bCs/>
-          <w:sz w:val="24"/>
-          <w:szCs w:val="24"/>
-        </w:rPr>
-      </w:pPr>
-      <w:r>
-        <w:rPr>
-          <w:rFonts w:ascii="Times New Roman" w:hAnsi="Times New Roman" w:cs="Times New Roman"/>
-          <w:sz w:val="24"/>
-          <w:szCs w:val="24"/>
-        </w:rPr>
-        <w:t>Pritiskom na neku od sjednica, korisnika se prebacuje na stranicu za prikaz točki dnevnoga reda vezanih za tu sjednicu. Korisnici imaju uvid u sve točke dnevnoga reda</w:t>
-      </w:r>
-      <w:r>
-        <w:rPr>
-          <w:rFonts w:ascii="Times New Roman" w:hAnsi="Times New Roman" w:cs="Times New Roman"/>
-          <w:sz w:val="24"/>
-          <w:szCs w:val="24"/>
-        </w:rPr>
-        <w:t>,</w:t>
+          <w:sz w:val="24"/>
+          <w:szCs w:val="24"/>
+        </w:rPr>
+      </w:pPr>
+      <w:r>
+        <w:rPr>
+          <w:rFonts w:ascii="Times New Roman" w:hAnsi="Times New Roman" w:cs="Times New Roman"/>
+          <w:sz w:val="24"/>
+          <w:szCs w:val="24"/>
+        </w:rPr>
+        <w:t>Za promjenu korisnikove lozinke potrebno je unesti trenutnu aktivnu lozinku koja se koriste zajedno sa novom željenom lozink</w:t>
+      </w:r>
+      <w:r>
+        <w:rPr>
+          <w:rFonts w:ascii="Times New Roman" w:hAnsi="Times New Roman" w:cs="Times New Roman"/>
+          <w:sz w:val="24"/>
+          <w:szCs w:val="24"/>
+        </w:rPr>
+        <w:t>om</w:t>
       </w:r>
       <w:r>
         <w:rPr>
@@ -24620,49 +25786,199 @@
           <w:sz w:val="24"/>
           <w:szCs w:val="24"/>
         </w:rPr>
-        <w:t xml:space="preserve">a </w:t>
-      </w:r>
-      <w:r>
-        <w:rPr>
-          <w:rFonts w:ascii="Times New Roman" w:hAnsi="Times New Roman" w:cs="Times New Roman"/>
-          <w:sz w:val="24"/>
-          <w:szCs w:val="24"/>
-        </w:rPr>
-        <w:t xml:space="preserve">ovisno o ulozi ograničene su im akcije na </w:t>
-      </w:r>
-      <w:r>
-        <w:rPr>
-          <w:rFonts w:ascii="Times New Roman" w:hAnsi="Times New Roman" w:cs="Times New Roman"/>
-          <w:sz w:val="24"/>
-          <w:szCs w:val="24"/>
-        </w:rPr>
-        <w:t xml:space="preserve">toj </w:t>
-      </w:r>
-      <w:r>
-        <w:rPr>
-          <w:rFonts w:ascii="Times New Roman" w:hAnsi="Times New Roman" w:cs="Times New Roman"/>
-          <w:sz w:val="24"/>
-          <w:szCs w:val="24"/>
-        </w:rPr>
-        <w:t xml:space="preserve">stranici. Prikaz njihovih razlika vidljiv je na </w:t>
-      </w:r>
-      <w:r>
-        <w:rPr>
-          <w:rFonts w:ascii="Times New Roman" w:hAnsi="Times New Roman" w:cs="Times New Roman"/>
-          <w:b/>
-          <w:bCs/>
-          <w:sz w:val="24"/>
-          <w:szCs w:val="24"/>
-        </w:rPr>
-        <w:t xml:space="preserve">slikama </w:t>
-      </w:r>
-      <w:r>
-        <w:rPr>
-          <w:rFonts w:ascii="Times New Roman" w:hAnsi="Times New Roman" w:cs="Times New Roman"/>
-          <w:b/>
-          <w:bCs/>
-          <w:sz w:val="24"/>
-          <w:szCs w:val="24"/>
+        <w:t>te</w:t>
+      </w:r>
+      <w:r>
+        <w:rPr>
+          <w:rFonts w:ascii="Times New Roman" w:hAnsi="Times New Roman" w:cs="Times New Roman"/>
+          <w:sz w:val="24"/>
+          <w:szCs w:val="24"/>
+        </w:rPr>
+        <w:t xml:space="preserve"> ponovnim upisom</w:t>
+      </w:r>
+      <w:r>
+        <w:rPr>
+          <w:rFonts w:ascii="Times New Roman" w:hAnsi="Times New Roman" w:cs="Times New Roman"/>
+          <w:sz w:val="24"/>
+          <w:szCs w:val="24"/>
+        </w:rPr>
+        <w:t xml:space="preserve"> </w:t>
+      </w:r>
+      <w:r>
+        <w:rPr>
+          <w:rFonts w:ascii="Times New Roman" w:hAnsi="Times New Roman" w:cs="Times New Roman"/>
+          <w:sz w:val="24"/>
+          <w:szCs w:val="24"/>
+        </w:rPr>
+        <w:t>nove lozinke</w:t>
+      </w:r>
+      <w:r>
+        <w:rPr>
+          <w:rFonts w:ascii="Times New Roman" w:hAnsi="Times New Roman" w:cs="Times New Roman"/>
+          <w:sz w:val="24"/>
+          <w:szCs w:val="24"/>
+        </w:rPr>
+        <w:t xml:space="preserve"> za provjeru</w:t>
+      </w:r>
+      <w:r>
+        <w:rPr>
+          <w:rFonts w:ascii="Times New Roman" w:hAnsi="Times New Roman" w:cs="Times New Roman"/>
+          <w:sz w:val="24"/>
+          <w:szCs w:val="24"/>
+        </w:rPr>
+        <w:t>.</w:t>
+      </w:r>
+      <w:r>
+        <w:rPr>
+          <w:rFonts w:ascii="Times New Roman" w:hAnsi="Times New Roman" w:cs="Times New Roman"/>
+          <w:sz w:val="24"/>
+          <w:szCs w:val="24"/>
+        </w:rPr>
+        <w:t xml:space="preserve"> Prikazano </w:t>
+      </w:r>
+      <w:r>
+        <w:rPr>
+          <w:rFonts w:ascii="Times New Roman" w:hAnsi="Times New Roman" w:cs="Times New Roman"/>
+          <w:sz w:val="24"/>
+          <w:szCs w:val="24"/>
+        </w:rPr>
+        <w:t xml:space="preserve">na </w:t>
+      </w:r>
+      <w:r>
+        <w:rPr>
+          <w:rFonts w:ascii="Times New Roman" w:hAnsi="Times New Roman" w:cs="Times New Roman"/>
+          <w:b/>
+          <w:bCs/>
+          <w:sz w:val="24"/>
+          <w:szCs w:val="24"/>
+        </w:rPr>
+        <w:t>slici 5.9.</w:t>
+      </w:r>
+    </w:p>
+    <w:p>
+      <w:pPr>
+        <w:keepNext/>
+        <w:jc w:val="center"/>
+      </w:pPr>
+      <w:r>
+        <w:rPr>
+          <w:rFonts w:ascii="Times New Roman" w:hAnsi="Times New Roman" w:cs="Times New Roman"/>
+        </w:rPr>
+        <w:lastRenderedPageBreak/>
+        <w:drawing>
+          <wp:inline distT="0" distB="0" distL="0" distR="0" wp14:anchorId="6B8EB08E" wp14:editId="22FE8DB8">
+            <wp:extent cx="5338248" cy="3888121"/>
+            <wp:effectExtent l="0" t="0" r="0" b="0"/>
+            <wp:docPr id="301712918" name="Slika 1" descr="Slika na kojoj se prikazuje tekst, snimka zaslona, softver, Multimedijski softver&#10;&#10;Sadržaj generiran uz AI možda nije točan."/>
+            <wp:cNvGraphicFramePr>
+              <a:graphicFrameLocks xmlns:a="http://schemas.openxmlformats.org/drawingml/2006/main" noChangeAspect="1"/>
+            </wp:cNvGraphicFramePr>
+            <a:graphic xmlns:a="http://schemas.openxmlformats.org/drawingml/2006/main">
+              <a:graphicData uri="http://schemas.openxmlformats.org/drawingml/2006/picture">
+                <pic:pic xmlns:pic="http://schemas.openxmlformats.org/drawingml/2006/picture">
+                  <pic:nvPicPr>
+                    <pic:cNvPr id="301712918" name="Slika 1" descr="Slika na kojoj se prikazuje tekst, snimka zaslona, softver, Multimedijski softver&#10;&#10;Sadržaj generiran uz AI možda nije točan."/>
+                    <pic:cNvPicPr/>
+                  </pic:nvPicPr>
+                  <pic:blipFill>
+                    <a:blip r:embed="rId61"/>
+                    <a:stretch>
+                      <a:fillRect/>
+                    </a:stretch>
+                  </pic:blipFill>
+                  <pic:spPr>
+                    <a:xfrm>
+                      <a:off x="0" y="0"/>
+                      <a:ext cx="5346015" cy="3893778"/>
+                    </a:xfrm>
+                    <a:prstGeom prst="rect">
+                      <a:avLst/>
+                    </a:prstGeom>
+                  </pic:spPr>
+                </pic:pic>
+              </a:graphicData>
+            </a:graphic>
+          </wp:inline>
+        </w:drawing>
+      </w:r>
+    </w:p>
+    <w:p>
+      <w:pPr>
+        <w:pStyle w:val="Opisslike"/>
+        <w:spacing w:line="360" w:lineRule="auto"/>
+        <w:jc w:val="center"/>
+        <w:rPr>
+          <w:rFonts w:ascii="Times New Roman" w:hAnsi="Times New Roman" w:cs="Times New Roman"/>
+          <w:i w:val="0"/>
+          <w:iCs w:val="0"/>
+          <w:color w:val="auto"/>
+          <w:sz w:val="20"/>
+          <w:szCs w:val="20"/>
+        </w:rPr>
+      </w:pPr>
+      <w:r>
+        <w:rPr>
+          <w:rFonts w:ascii="Times New Roman" w:hAnsi="Times New Roman" w:cs="Times New Roman"/>
+          <w:b/>
+          <w:bCs/>
+          <w:i w:val="0"/>
+          <w:iCs w:val="0"/>
+          <w:color w:val="auto"/>
+          <w:sz w:val="20"/>
+          <w:szCs w:val="20"/>
+        </w:rPr>
+        <w:t xml:space="preserve">Slika </w:t>
+      </w:r>
+      <w:r>
+        <w:rPr>
+          <w:rFonts w:ascii="Times New Roman" w:hAnsi="Times New Roman" w:cs="Times New Roman"/>
+          <w:b/>
+          <w:bCs/>
+          <w:i w:val="0"/>
+          <w:iCs w:val="0"/>
+          <w:color w:val="auto"/>
+          <w:sz w:val="20"/>
+          <w:szCs w:val="20"/>
+        </w:rPr>
+        <w:fldChar w:fldCharType="begin"/>
+      </w:r>
+      <w:r>
+        <w:rPr>
+          <w:rFonts w:ascii="Times New Roman" w:hAnsi="Times New Roman" w:cs="Times New Roman"/>
+          <w:b/>
+          <w:bCs/>
+          <w:i w:val="0"/>
+          <w:iCs w:val="0"/>
+          <w:color w:val="auto"/>
+          <w:sz w:val="20"/>
+          <w:szCs w:val="20"/>
+        </w:rPr>
+        <w:instrText xml:space="preserve"> STYLEREF 1 \s </w:instrText>
+      </w:r>
+      <w:r>
+        <w:rPr>
+          <w:rFonts w:ascii="Times New Roman" w:hAnsi="Times New Roman" w:cs="Times New Roman"/>
+          <w:b/>
+          <w:bCs/>
+          <w:i w:val="0"/>
+          <w:iCs w:val="0"/>
+          <w:color w:val="auto"/>
+          <w:sz w:val="20"/>
+          <w:szCs w:val="20"/>
+        </w:rPr>
+        <w:fldChar w:fldCharType="separate"/>
+      </w:r>
+      <w:r>
+        <w:rPr>
+          <w:rFonts w:ascii="Times New Roman" w:hAnsi="Times New Roman" w:cs="Times New Roman"/>
+          <w:b/>
+          <w:bCs/>
+          <w:i w:val="0"/>
+          <w:iCs w:val="0"/>
+          <w:noProof/>
+          <w:color w:val="auto"/>
+          <w:sz w:val="20"/>
+          <w:szCs w:val="20"/>
         </w:rPr>
         <w:t>5</w:t>
       </w:r>
@@ -24671,30 +25987,279 @@
           <w:rFonts w:ascii="Times New Roman" w:hAnsi="Times New Roman" w:cs="Times New Roman"/>
           <w:b/>
           <w:bCs/>
-          <w:sz w:val="24"/>
-          <w:szCs w:val="24"/>
-        </w:rPr>
-        <w:t xml:space="preserve">.7 i </w:t>
-      </w:r>
-      <w:r>
-        <w:rPr>
-          <w:rFonts w:ascii="Times New Roman" w:hAnsi="Times New Roman" w:cs="Times New Roman"/>
-          <w:b/>
-          <w:bCs/>
-          <w:sz w:val="24"/>
-          <w:szCs w:val="24"/>
-        </w:rPr>
-        <w:t>5</w:t>
-      </w:r>
-      <w:r>
-        <w:rPr>
-          <w:rFonts w:ascii="Times New Roman" w:hAnsi="Times New Roman" w:cs="Times New Roman"/>
-          <w:b/>
-          <w:bCs/>
-          <w:sz w:val="24"/>
-          <w:szCs w:val="24"/>
-        </w:rPr>
-        <w:t>.8.</w:t>
+          <w:i w:val="0"/>
+          <w:iCs w:val="0"/>
+          <w:color w:val="auto"/>
+          <w:sz w:val="20"/>
+          <w:szCs w:val="20"/>
+        </w:rPr>
+        <w:fldChar w:fldCharType="end"/>
+      </w:r>
+      <w:r>
+        <w:rPr>
+          <w:rFonts w:ascii="Times New Roman" w:hAnsi="Times New Roman" w:cs="Times New Roman"/>
+          <w:b/>
+          <w:bCs/>
+          <w:i w:val="0"/>
+          <w:iCs w:val="0"/>
+          <w:color w:val="auto"/>
+          <w:sz w:val="20"/>
+          <w:szCs w:val="20"/>
+        </w:rPr>
+        <w:t>.</w:t>
+      </w:r>
+      <w:r>
+        <w:rPr>
+          <w:rFonts w:ascii="Times New Roman" w:hAnsi="Times New Roman" w:cs="Times New Roman"/>
+          <w:b/>
+          <w:bCs/>
+          <w:i w:val="0"/>
+          <w:iCs w:val="0"/>
+          <w:color w:val="auto"/>
+          <w:sz w:val="20"/>
+          <w:szCs w:val="20"/>
+        </w:rPr>
+        <w:fldChar w:fldCharType="begin"/>
+      </w:r>
+      <w:r>
+        <w:rPr>
+          <w:rFonts w:ascii="Times New Roman" w:hAnsi="Times New Roman" w:cs="Times New Roman"/>
+          <w:b/>
+          <w:bCs/>
+          <w:i w:val="0"/>
+          <w:iCs w:val="0"/>
+          <w:color w:val="auto"/>
+          <w:sz w:val="20"/>
+          <w:szCs w:val="20"/>
+        </w:rPr>
+        <w:instrText xml:space="preserve"> SEQ Slika \* ARABIC \s 1 </w:instrText>
+      </w:r>
+      <w:r>
+        <w:rPr>
+          <w:rFonts w:ascii="Times New Roman" w:hAnsi="Times New Roman" w:cs="Times New Roman"/>
+          <w:b/>
+          <w:bCs/>
+          <w:i w:val="0"/>
+          <w:iCs w:val="0"/>
+          <w:color w:val="auto"/>
+          <w:sz w:val="20"/>
+          <w:szCs w:val="20"/>
+        </w:rPr>
+        <w:fldChar w:fldCharType="separate"/>
+      </w:r>
+      <w:r>
+        <w:rPr>
+          <w:rFonts w:ascii="Times New Roman" w:hAnsi="Times New Roman" w:cs="Times New Roman"/>
+          <w:b/>
+          <w:bCs/>
+          <w:i w:val="0"/>
+          <w:iCs w:val="0"/>
+          <w:noProof/>
+          <w:color w:val="auto"/>
+          <w:sz w:val="20"/>
+          <w:szCs w:val="20"/>
+        </w:rPr>
+        <w:t>9</w:t>
+      </w:r>
+      <w:r>
+        <w:rPr>
+          <w:rFonts w:ascii="Times New Roman" w:hAnsi="Times New Roman" w:cs="Times New Roman"/>
+          <w:b/>
+          <w:bCs/>
+          <w:i w:val="0"/>
+          <w:iCs w:val="0"/>
+          <w:color w:val="auto"/>
+          <w:sz w:val="20"/>
+          <w:szCs w:val="20"/>
+        </w:rPr>
+        <w:fldChar w:fldCharType="end"/>
+      </w:r>
+      <w:r>
+        <w:rPr>
+          <w:rFonts w:ascii="Times New Roman" w:hAnsi="Times New Roman" w:cs="Times New Roman"/>
+          <w:b/>
+          <w:bCs/>
+          <w:i w:val="0"/>
+          <w:iCs w:val="0"/>
+          <w:color w:val="auto"/>
+          <w:sz w:val="20"/>
+          <w:szCs w:val="20"/>
+        </w:rPr>
+        <w:t>:</w:t>
+      </w:r>
+      <w:r>
+        <w:rPr>
+          <w:rFonts w:ascii="Times New Roman" w:hAnsi="Times New Roman" w:cs="Times New Roman"/>
+          <w:i w:val="0"/>
+          <w:iCs w:val="0"/>
+          <w:color w:val="auto"/>
+          <w:sz w:val="20"/>
+          <w:szCs w:val="20"/>
+        </w:rPr>
+        <w:t xml:space="preserve"> Prikaz modala za promjenu korisnikove lozinke</w:t>
+      </w:r>
+    </w:p>
+    <w:p>
+      <w:pPr>
+        <w:spacing w:line="360" w:lineRule="auto"/>
+        <w:jc w:val="both"/>
+        <w:rPr>
+          <w:rFonts w:ascii="Times New Roman" w:hAnsi="Times New Roman" w:cs="Times New Roman"/>
+          <w:b/>
+          <w:bCs/>
+          <w:sz w:val="24"/>
+          <w:szCs w:val="24"/>
+        </w:rPr>
+      </w:pPr>
+      <w:r>
+        <w:rPr>
+          <w:rFonts w:ascii="Times New Roman" w:hAnsi="Times New Roman" w:cs="Times New Roman"/>
+          <w:sz w:val="24"/>
+          <w:szCs w:val="24"/>
+        </w:rPr>
+        <w:t xml:space="preserve">Ukoliko je prijavljeni korisnik admin ispod gumba „Promijeni lozinku“ nalazi se dodatni gumb </w:t>
+      </w:r>
+      <w:r>
+        <w:rPr>
+          <w:rFonts w:ascii="Times New Roman" w:hAnsi="Times New Roman" w:cs="Times New Roman"/>
+          <w:sz w:val="24"/>
+          <w:szCs w:val="24"/>
+        </w:rPr>
+        <w:t xml:space="preserve">„Tablica korisnika“ </w:t>
+      </w:r>
+      <w:r>
+        <w:rPr>
+          <w:rFonts w:ascii="Times New Roman" w:hAnsi="Times New Roman" w:cs="Times New Roman"/>
+          <w:sz w:val="24"/>
+          <w:szCs w:val="24"/>
+        </w:rPr>
+        <w:t xml:space="preserve">kojim </w:t>
+      </w:r>
+      <w:r>
+        <w:rPr>
+          <w:rFonts w:ascii="Times New Roman" w:hAnsi="Times New Roman" w:cs="Times New Roman"/>
+          <w:sz w:val="24"/>
+          <w:szCs w:val="24"/>
+        </w:rPr>
+        <w:t xml:space="preserve">se </w:t>
+      </w:r>
+      <w:r>
+        <w:rPr>
+          <w:rFonts w:ascii="Times New Roman" w:hAnsi="Times New Roman" w:cs="Times New Roman"/>
+          <w:sz w:val="24"/>
+          <w:szCs w:val="24"/>
+        </w:rPr>
+        <w:t>otvara tablic</w:t>
+      </w:r>
+      <w:r>
+        <w:rPr>
+          <w:rFonts w:ascii="Times New Roman" w:hAnsi="Times New Roman" w:cs="Times New Roman"/>
+          <w:sz w:val="24"/>
+          <w:szCs w:val="24"/>
+        </w:rPr>
+        <w:t>a s</w:t>
+      </w:r>
+      <w:r>
+        <w:rPr>
+          <w:rFonts w:ascii="Times New Roman" w:hAnsi="Times New Roman" w:cs="Times New Roman"/>
+          <w:sz w:val="24"/>
+          <w:szCs w:val="24"/>
+        </w:rPr>
+        <w:t xml:space="preserve"> trenutno registriranim korisnicama</w:t>
+      </w:r>
+      <w:r>
+        <w:rPr>
+          <w:rFonts w:ascii="Times New Roman" w:hAnsi="Times New Roman" w:cs="Times New Roman"/>
+          <w:sz w:val="24"/>
+          <w:szCs w:val="24"/>
+        </w:rPr>
+        <w:t xml:space="preserve">. Adminu je omogućena izmjena </w:t>
+      </w:r>
+      <w:r>
+        <w:rPr>
+          <w:rFonts w:ascii="Times New Roman" w:hAnsi="Times New Roman" w:cs="Times New Roman"/>
+          <w:sz w:val="24"/>
+          <w:szCs w:val="24"/>
+        </w:rPr>
+        <w:t>uloga svih</w:t>
+      </w:r>
+      <w:r>
+        <w:rPr>
+          <w:rFonts w:ascii="Times New Roman" w:hAnsi="Times New Roman" w:cs="Times New Roman"/>
+          <w:sz w:val="24"/>
+          <w:szCs w:val="24"/>
+        </w:rPr>
+        <w:t xml:space="preserve"> korisnika iz tablic</w:t>
+      </w:r>
+      <w:r>
+        <w:rPr>
+          <w:rFonts w:ascii="Times New Roman" w:hAnsi="Times New Roman" w:cs="Times New Roman"/>
+          <w:sz w:val="24"/>
+          <w:szCs w:val="24"/>
+        </w:rPr>
+        <w:t>e</w:t>
+      </w:r>
+      <w:r>
+        <w:rPr>
+          <w:rFonts w:ascii="Times New Roman" w:hAnsi="Times New Roman" w:cs="Times New Roman"/>
+          <w:sz w:val="24"/>
+          <w:szCs w:val="24"/>
+        </w:rPr>
+        <w:t xml:space="preserve">, pritiskom na određenog korisnika otvara sa modalni prozor sa ponuđenim </w:t>
+      </w:r>
+      <w:r>
+        <w:rPr>
+          <w:rFonts w:ascii="Times New Roman" w:hAnsi="Times New Roman" w:cs="Times New Roman"/>
+          <w:sz w:val="24"/>
+          <w:szCs w:val="24"/>
+        </w:rPr>
+        <w:t>ulogama</w:t>
+      </w:r>
+      <w:r>
+        <w:rPr>
+          <w:rFonts w:ascii="Times New Roman" w:hAnsi="Times New Roman" w:cs="Times New Roman"/>
+          <w:sz w:val="24"/>
+          <w:szCs w:val="24"/>
+        </w:rPr>
+        <w:t xml:space="preserve"> koje može dodijeliti korisniku.</w:t>
+      </w:r>
+      <w:r>
+        <w:rPr>
+          <w:rFonts w:ascii="Times New Roman" w:hAnsi="Times New Roman" w:cs="Times New Roman"/>
+          <w:sz w:val="24"/>
+          <w:szCs w:val="24"/>
+        </w:rPr>
+        <w:t xml:space="preserve"> Prikazano na </w:t>
+      </w:r>
+      <w:r>
+        <w:rPr>
+          <w:rFonts w:ascii="Times New Roman" w:hAnsi="Times New Roman" w:cs="Times New Roman"/>
+          <w:b/>
+          <w:bCs/>
+          <w:sz w:val="24"/>
+          <w:szCs w:val="24"/>
+        </w:rPr>
+        <w:t>sli</w:t>
+      </w:r>
+      <w:r>
+        <w:rPr>
+          <w:rFonts w:ascii="Times New Roman" w:hAnsi="Times New Roman" w:cs="Times New Roman"/>
+          <w:b/>
+          <w:bCs/>
+          <w:sz w:val="24"/>
+          <w:szCs w:val="24"/>
+        </w:rPr>
+        <w:t>kama</w:t>
+      </w:r>
+      <w:r>
+        <w:rPr>
+          <w:rFonts w:ascii="Times New Roman" w:hAnsi="Times New Roman" w:cs="Times New Roman"/>
+          <w:b/>
+          <w:bCs/>
+          <w:sz w:val="24"/>
+          <w:szCs w:val="24"/>
+        </w:rPr>
+        <w:t xml:space="preserve"> 5.10. i 5.11.</w:t>
       </w:r>
     </w:p>
     <w:p>
@@ -24702,20 +26267,783 @@
         <w:keepNext/>
         <w:spacing w:line="360" w:lineRule="auto"/>
         <w:jc w:val="both"/>
-        <w:rPr>
-          <w:rFonts w:ascii="Times New Roman" w:hAnsi="Times New Roman" w:cs="Times New Roman"/>
-        </w:rPr>
-      </w:pPr>
-      <w:r>
-        <w:rPr>
-          <w:rFonts w:ascii="Times New Roman" w:hAnsi="Times New Roman" w:cs="Times New Roman"/>
-          <w:b/>
-          <w:bCs/>
+      </w:pPr>
+      <w:r>
+        <w:rPr>
+          <w:rFonts w:ascii="Times New Roman" w:hAnsi="Times New Roman" w:cs="Times New Roman"/>
+          <w:sz w:val="24"/>
+          <w:szCs w:val="24"/>
+        </w:rPr>
+        <w:drawing>
+          <wp:inline distT="0" distB="0" distL="0" distR="0" wp14:anchorId="0504EEC2" wp14:editId="63CEE855">
+            <wp:extent cx="5939790" cy="1945640"/>
+            <wp:effectExtent l="0" t="0" r="3810" b="0"/>
+            <wp:docPr id="1041866991" name="Slika 1" descr="Slika na kojoj se prikazuje tekst, snimka zaslona, Font, broj&#10;&#10;Sadržaj generiran uz AI možda nije točan."/>
+            <wp:cNvGraphicFramePr>
+              <a:graphicFrameLocks xmlns:a="http://schemas.openxmlformats.org/drawingml/2006/main" noChangeAspect="1"/>
+            </wp:cNvGraphicFramePr>
+            <a:graphic xmlns:a="http://schemas.openxmlformats.org/drawingml/2006/main">
+              <a:graphicData uri="http://schemas.openxmlformats.org/drawingml/2006/picture">
+                <pic:pic xmlns:pic="http://schemas.openxmlformats.org/drawingml/2006/picture">
+                  <pic:nvPicPr>
+                    <pic:cNvPr id="1041866991" name="Slika 1" descr="Slika na kojoj se prikazuje tekst, snimka zaslona, Font, broj&#10;&#10;Sadržaj generiran uz AI možda nije točan."/>
+                    <pic:cNvPicPr/>
+                  </pic:nvPicPr>
+                  <pic:blipFill>
+                    <a:blip r:embed="rId62"/>
+                    <a:stretch>
+                      <a:fillRect/>
+                    </a:stretch>
+                  </pic:blipFill>
+                  <pic:spPr>
+                    <a:xfrm>
+                      <a:off x="0" y="0"/>
+                      <a:ext cx="5939790" cy="1945640"/>
+                    </a:xfrm>
+                    <a:prstGeom prst="rect">
+                      <a:avLst/>
+                    </a:prstGeom>
+                  </pic:spPr>
+                </pic:pic>
+              </a:graphicData>
+            </a:graphic>
+          </wp:inline>
+        </w:drawing>
+      </w:r>
+    </w:p>
+    <w:p>
+      <w:pPr>
+        <w:pStyle w:val="Opisslike"/>
+        <w:spacing w:line="276" w:lineRule="auto"/>
+        <w:jc w:val="center"/>
+        <w:rPr>
+          <w:rFonts w:ascii="Times New Roman" w:hAnsi="Times New Roman" w:cs="Times New Roman"/>
+          <w:i w:val="0"/>
+          <w:iCs w:val="0"/>
+          <w:color w:val="auto"/>
+          <w:sz w:val="20"/>
+          <w:szCs w:val="20"/>
+        </w:rPr>
+      </w:pPr>
+      <w:r>
+        <w:rPr>
+          <w:rFonts w:ascii="Times New Roman" w:hAnsi="Times New Roman" w:cs="Times New Roman"/>
+          <w:b/>
+          <w:bCs/>
+          <w:i w:val="0"/>
+          <w:iCs w:val="0"/>
+          <w:color w:val="auto"/>
+          <w:sz w:val="20"/>
+          <w:szCs w:val="20"/>
+        </w:rPr>
+        <w:t xml:space="preserve">Slika </w:t>
+      </w:r>
+      <w:r>
+        <w:rPr>
+          <w:rFonts w:ascii="Times New Roman" w:hAnsi="Times New Roman" w:cs="Times New Roman"/>
+          <w:b/>
+          <w:bCs/>
+          <w:i w:val="0"/>
+          <w:iCs w:val="0"/>
+          <w:color w:val="auto"/>
+          <w:sz w:val="20"/>
+          <w:szCs w:val="20"/>
+        </w:rPr>
+        <w:fldChar w:fldCharType="begin"/>
+      </w:r>
+      <w:r>
+        <w:rPr>
+          <w:rFonts w:ascii="Times New Roman" w:hAnsi="Times New Roman" w:cs="Times New Roman"/>
+          <w:b/>
+          <w:bCs/>
+          <w:i w:val="0"/>
+          <w:iCs w:val="0"/>
+          <w:color w:val="auto"/>
+          <w:sz w:val="20"/>
+          <w:szCs w:val="20"/>
+        </w:rPr>
+        <w:instrText xml:space="preserve"> STYLEREF 1 \s </w:instrText>
+      </w:r>
+      <w:r>
+        <w:rPr>
+          <w:rFonts w:ascii="Times New Roman" w:hAnsi="Times New Roman" w:cs="Times New Roman"/>
+          <w:b/>
+          <w:bCs/>
+          <w:i w:val="0"/>
+          <w:iCs w:val="0"/>
+          <w:color w:val="auto"/>
+          <w:sz w:val="20"/>
+          <w:szCs w:val="20"/>
+        </w:rPr>
+        <w:fldChar w:fldCharType="separate"/>
+      </w:r>
+      <w:r>
+        <w:rPr>
+          <w:rFonts w:ascii="Times New Roman" w:hAnsi="Times New Roman" w:cs="Times New Roman"/>
+          <w:b/>
+          <w:bCs/>
+          <w:i w:val="0"/>
+          <w:iCs w:val="0"/>
           <w:noProof/>
-          <w:sz w:val="24"/>
-          <w:szCs w:val="24"/>
-        </w:rPr>
+          <w:color w:val="auto"/>
+          <w:sz w:val="20"/>
+          <w:szCs w:val="20"/>
+        </w:rPr>
+        <w:t>5</w:t>
+      </w:r>
+      <w:r>
+        <w:rPr>
+          <w:rFonts w:ascii="Times New Roman" w:hAnsi="Times New Roman" w:cs="Times New Roman"/>
+          <w:b/>
+          <w:bCs/>
+          <w:i w:val="0"/>
+          <w:iCs w:val="0"/>
+          <w:color w:val="auto"/>
+          <w:sz w:val="20"/>
+          <w:szCs w:val="20"/>
+        </w:rPr>
+        <w:fldChar w:fldCharType="end"/>
+      </w:r>
+      <w:r>
+        <w:rPr>
+          <w:rFonts w:ascii="Times New Roman" w:hAnsi="Times New Roman" w:cs="Times New Roman"/>
+          <w:b/>
+          <w:bCs/>
+          <w:i w:val="0"/>
+          <w:iCs w:val="0"/>
+          <w:color w:val="auto"/>
+          <w:sz w:val="20"/>
+          <w:szCs w:val="20"/>
+        </w:rPr>
+        <w:t>.</w:t>
+      </w:r>
+      <w:r>
+        <w:rPr>
+          <w:rFonts w:ascii="Times New Roman" w:hAnsi="Times New Roman" w:cs="Times New Roman"/>
+          <w:b/>
+          <w:bCs/>
+          <w:i w:val="0"/>
+          <w:iCs w:val="0"/>
+          <w:color w:val="auto"/>
+          <w:sz w:val="20"/>
+          <w:szCs w:val="20"/>
+        </w:rPr>
+        <w:fldChar w:fldCharType="begin"/>
+      </w:r>
+      <w:r>
+        <w:rPr>
+          <w:rFonts w:ascii="Times New Roman" w:hAnsi="Times New Roman" w:cs="Times New Roman"/>
+          <w:b/>
+          <w:bCs/>
+          <w:i w:val="0"/>
+          <w:iCs w:val="0"/>
+          <w:color w:val="auto"/>
+          <w:sz w:val="20"/>
+          <w:szCs w:val="20"/>
+        </w:rPr>
+        <w:instrText xml:space="preserve"> SEQ Slika \* ARABIC \s 1 </w:instrText>
+      </w:r>
+      <w:r>
+        <w:rPr>
+          <w:rFonts w:ascii="Times New Roman" w:hAnsi="Times New Roman" w:cs="Times New Roman"/>
+          <w:b/>
+          <w:bCs/>
+          <w:i w:val="0"/>
+          <w:iCs w:val="0"/>
+          <w:color w:val="auto"/>
+          <w:sz w:val="20"/>
+          <w:szCs w:val="20"/>
+        </w:rPr>
+        <w:fldChar w:fldCharType="separate"/>
+      </w:r>
+      <w:r>
+        <w:rPr>
+          <w:rFonts w:ascii="Times New Roman" w:hAnsi="Times New Roman" w:cs="Times New Roman"/>
+          <w:b/>
+          <w:bCs/>
+          <w:i w:val="0"/>
+          <w:iCs w:val="0"/>
+          <w:noProof/>
+          <w:color w:val="auto"/>
+          <w:sz w:val="20"/>
+          <w:szCs w:val="20"/>
+        </w:rPr>
+        <w:t>10</w:t>
+      </w:r>
+      <w:r>
+        <w:rPr>
+          <w:rFonts w:ascii="Times New Roman" w:hAnsi="Times New Roman" w:cs="Times New Roman"/>
+          <w:b/>
+          <w:bCs/>
+          <w:i w:val="0"/>
+          <w:iCs w:val="0"/>
+          <w:color w:val="auto"/>
+          <w:sz w:val="20"/>
+          <w:szCs w:val="20"/>
+        </w:rPr>
+        <w:fldChar w:fldCharType="end"/>
+      </w:r>
+      <w:r>
+        <w:rPr>
+          <w:rFonts w:ascii="Times New Roman" w:hAnsi="Times New Roman" w:cs="Times New Roman"/>
+          <w:b/>
+          <w:bCs/>
+          <w:i w:val="0"/>
+          <w:iCs w:val="0"/>
+          <w:color w:val="auto"/>
+          <w:sz w:val="20"/>
+          <w:szCs w:val="20"/>
+        </w:rPr>
+        <w:t>:</w:t>
+      </w:r>
+      <w:r>
+        <w:rPr>
+          <w:rFonts w:ascii="Times New Roman" w:hAnsi="Times New Roman" w:cs="Times New Roman"/>
+          <w:i w:val="0"/>
+          <w:iCs w:val="0"/>
+          <w:color w:val="auto"/>
+          <w:sz w:val="20"/>
+          <w:szCs w:val="20"/>
+        </w:rPr>
+        <w:t xml:space="preserve"> Prikaz stranica za ulogu admin</w:t>
+      </w:r>
+    </w:p>
+    <w:p>
+      <w:pPr>
+        <w:keepNext/>
+      </w:pPr>
+      <w:r>
         <w:lastRenderedPageBreak/>
+        <w:drawing>
+          <wp:inline distT="0" distB="0" distL="0" distR="0" wp14:anchorId="2B69EBCD" wp14:editId="146CE8CE">
+            <wp:extent cx="5939790" cy="2743200"/>
+            <wp:effectExtent l="0" t="0" r="3810" b="0"/>
+            <wp:docPr id="257148441" name="Slika 1" descr="Slika na kojoj se prikazuje tekst, softver, Ikona na računalu, Multimedijski softver&#10;&#10;Sadržaj generiran uz AI možda nije točan."/>
+            <wp:cNvGraphicFramePr>
+              <a:graphicFrameLocks xmlns:a="http://schemas.openxmlformats.org/drawingml/2006/main" noChangeAspect="1"/>
+            </wp:cNvGraphicFramePr>
+            <a:graphic xmlns:a="http://schemas.openxmlformats.org/drawingml/2006/main">
+              <a:graphicData uri="http://schemas.openxmlformats.org/drawingml/2006/picture">
+                <pic:pic xmlns:pic="http://schemas.openxmlformats.org/drawingml/2006/picture">
+                  <pic:nvPicPr>
+                    <pic:cNvPr id="257148441" name="Slika 1" descr="Slika na kojoj se prikazuje tekst, softver, Ikona na računalu, Multimedijski softver&#10;&#10;Sadržaj generiran uz AI možda nije točan."/>
+                    <pic:cNvPicPr/>
+                  </pic:nvPicPr>
+                  <pic:blipFill>
+                    <a:blip r:embed="rId63"/>
+                    <a:stretch>
+                      <a:fillRect/>
+                    </a:stretch>
+                  </pic:blipFill>
+                  <pic:spPr>
+                    <a:xfrm>
+                      <a:off x="0" y="0"/>
+                      <a:ext cx="5939790" cy="2743200"/>
+                    </a:xfrm>
+                    <a:prstGeom prst="rect">
+                      <a:avLst/>
+                    </a:prstGeom>
+                  </pic:spPr>
+                </pic:pic>
+              </a:graphicData>
+            </a:graphic>
+          </wp:inline>
+        </w:drawing>
+      </w:r>
+    </w:p>
+    <w:p>
+      <w:pPr>
+        <w:pStyle w:val="Opisslike"/>
+        <w:spacing w:line="360" w:lineRule="auto"/>
+        <w:jc w:val="center"/>
+        <w:rPr>
+          <w:rFonts w:ascii="Times New Roman" w:hAnsi="Times New Roman" w:cs="Times New Roman"/>
+          <w:i w:val="0"/>
+          <w:iCs w:val="0"/>
+          <w:sz w:val="20"/>
+          <w:szCs w:val="20"/>
+        </w:rPr>
+      </w:pPr>
+      <w:r>
+        <w:rPr>
+          <w:rFonts w:ascii="Times New Roman" w:hAnsi="Times New Roman" w:cs="Times New Roman"/>
+          <w:i w:val="0"/>
+          <w:iCs w:val="0"/>
+          <w:color w:val="auto"/>
+          <w:sz w:val="20"/>
+          <w:szCs w:val="20"/>
+        </w:rPr>
+        <w:t xml:space="preserve">Slika </w:t>
+      </w:r>
+      <w:r>
+        <w:rPr>
+          <w:rFonts w:ascii="Times New Roman" w:hAnsi="Times New Roman" w:cs="Times New Roman"/>
+          <w:i w:val="0"/>
+          <w:iCs w:val="0"/>
+          <w:color w:val="auto"/>
+          <w:sz w:val="20"/>
+          <w:szCs w:val="20"/>
+        </w:rPr>
+        <w:fldChar w:fldCharType="begin"/>
+      </w:r>
+      <w:r>
+        <w:rPr>
+          <w:rFonts w:ascii="Times New Roman" w:hAnsi="Times New Roman" w:cs="Times New Roman"/>
+          <w:i w:val="0"/>
+          <w:iCs w:val="0"/>
+          <w:color w:val="auto"/>
+          <w:sz w:val="20"/>
+          <w:szCs w:val="20"/>
+        </w:rPr>
+        <w:instrText xml:space="preserve"> STYLEREF 1 \s </w:instrText>
+      </w:r>
+      <w:r>
+        <w:rPr>
+          <w:rFonts w:ascii="Times New Roman" w:hAnsi="Times New Roman" w:cs="Times New Roman"/>
+          <w:i w:val="0"/>
+          <w:iCs w:val="0"/>
+          <w:color w:val="auto"/>
+          <w:sz w:val="20"/>
+          <w:szCs w:val="20"/>
+        </w:rPr>
+        <w:fldChar w:fldCharType="separate"/>
+      </w:r>
+      <w:r>
+        <w:rPr>
+          <w:rFonts w:ascii="Times New Roman" w:hAnsi="Times New Roman" w:cs="Times New Roman"/>
+          <w:i w:val="0"/>
+          <w:iCs w:val="0"/>
+          <w:noProof/>
+          <w:color w:val="auto"/>
+          <w:sz w:val="20"/>
+          <w:szCs w:val="20"/>
+        </w:rPr>
+        <w:t>5</w:t>
+      </w:r>
+      <w:r>
+        <w:rPr>
+          <w:rFonts w:ascii="Times New Roman" w:hAnsi="Times New Roman" w:cs="Times New Roman"/>
+          <w:i w:val="0"/>
+          <w:iCs w:val="0"/>
+          <w:color w:val="auto"/>
+          <w:sz w:val="20"/>
+          <w:szCs w:val="20"/>
+        </w:rPr>
+        <w:fldChar w:fldCharType="end"/>
+      </w:r>
+      <w:r>
+        <w:rPr>
+          <w:rFonts w:ascii="Times New Roman" w:hAnsi="Times New Roman" w:cs="Times New Roman"/>
+          <w:i w:val="0"/>
+          <w:iCs w:val="0"/>
+          <w:color w:val="auto"/>
+          <w:sz w:val="20"/>
+          <w:szCs w:val="20"/>
+        </w:rPr>
+        <w:t>.</w:t>
+      </w:r>
+      <w:r>
+        <w:rPr>
+          <w:rFonts w:ascii="Times New Roman" w:hAnsi="Times New Roman" w:cs="Times New Roman"/>
+          <w:i w:val="0"/>
+          <w:iCs w:val="0"/>
+          <w:color w:val="auto"/>
+          <w:sz w:val="20"/>
+          <w:szCs w:val="20"/>
+        </w:rPr>
+        <w:fldChar w:fldCharType="begin"/>
+      </w:r>
+      <w:r>
+        <w:rPr>
+          <w:rFonts w:ascii="Times New Roman" w:hAnsi="Times New Roman" w:cs="Times New Roman"/>
+          <w:i w:val="0"/>
+          <w:iCs w:val="0"/>
+          <w:color w:val="auto"/>
+          <w:sz w:val="20"/>
+          <w:szCs w:val="20"/>
+        </w:rPr>
+        <w:instrText xml:space="preserve"> SEQ Slika \* ARABIC \s 1 </w:instrText>
+      </w:r>
+      <w:r>
+        <w:rPr>
+          <w:rFonts w:ascii="Times New Roman" w:hAnsi="Times New Roman" w:cs="Times New Roman"/>
+          <w:i w:val="0"/>
+          <w:iCs w:val="0"/>
+          <w:color w:val="auto"/>
+          <w:sz w:val="20"/>
+          <w:szCs w:val="20"/>
+        </w:rPr>
+        <w:fldChar w:fldCharType="separate"/>
+      </w:r>
+      <w:r>
+        <w:rPr>
+          <w:rFonts w:ascii="Times New Roman" w:hAnsi="Times New Roman" w:cs="Times New Roman"/>
+          <w:i w:val="0"/>
+          <w:iCs w:val="0"/>
+          <w:noProof/>
+          <w:color w:val="auto"/>
+          <w:sz w:val="20"/>
+          <w:szCs w:val="20"/>
+        </w:rPr>
+        <w:t>11</w:t>
+      </w:r>
+      <w:r>
+        <w:rPr>
+          <w:rFonts w:ascii="Times New Roman" w:hAnsi="Times New Roman" w:cs="Times New Roman"/>
+          <w:i w:val="0"/>
+          <w:iCs w:val="0"/>
+          <w:color w:val="auto"/>
+          <w:sz w:val="20"/>
+          <w:szCs w:val="20"/>
+        </w:rPr>
+        <w:fldChar w:fldCharType="end"/>
+      </w:r>
+      <w:r>
+        <w:rPr>
+          <w:rFonts w:ascii="Times New Roman" w:hAnsi="Times New Roman" w:cs="Times New Roman"/>
+          <w:i w:val="0"/>
+          <w:iCs w:val="0"/>
+          <w:color w:val="auto"/>
+          <w:sz w:val="20"/>
+          <w:szCs w:val="20"/>
+        </w:rPr>
+        <w:t xml:space="preserve">: </w:t>
+      </w:r>
+      <w:r>
+        <w:rPr>
+          <w:rFonts w:ascii="Times New Roman" w:hAnsi="Times New Roman" w:cs="Times New Roman"/>
+          <w:i w:val="0"/>
+          <w:iCs w:val="0"/>
+          <w:sz w:val="20"/>
+          <w:szCs w:val="20"/>
+        </w:rPr>
+        <w:t>Prikaz stranice za prikaz tablice korisnika te modala za uređivanje rola</w:t>
+      </w:r>
+    </w:p>
+    <w:p>
+      <w:pPr>
+        <w:spacing w:line="360" w:lineRule="auto"/>
+        <w:jc w:val="both"/>
+        <w:rPr>
+          <w:rFonts w:ascii="Times New Roman" w:hAnsi="Times New Roman" w:cs="Times New Roman"/>
+          <w:sz w:val="24"/>
+          <w:szCs w:val="24"/>
+        </w:rPr>
+      </w:pPr>
+      <w:r>
+        <w:rPr>
+          <w:rFonts w:ascii="Times New Roman" w:hAnsi="Times New Roman" w:cs="Times New Roman"/>
+          <w:sz w:val="24"/>
+          <w:szCs w:val="24"/>
+        </w:rPr>
+        <w:t xml:space="preserve">Kao što je vidljivo na </w:t>
+      </w:r>
+      <w:r>
+        <w:rPr>
+          <w:rFonts w:ascii="Times New Roman" w:hAnsi="Times New Roman" w:cs="Times New Roman"/>
+          <w:b/>
+          <w:bCs/>
+          <w:sz w:val="24"/>
+          <w:szCs w:val="24"/>
+        </w:rPr>
+        <w:t>slici 5.11.</w:t>
+      </w:r>
+      <w:r>
+        <w:rPr>
+          <w:rFonts w:ascii="Times New Roman" w:hAnsi="Times New Roman" w:cs="Times New Roman"/>
+          <w:sz w:val="24"/>
+          <w:szCs w:val="24"/>
+        </w:rPr>
+        <w:t xml:space="preserve"> stranica za prikaz tablice korisnika omogućuje</w:t>
+      </w:r>
+      <w:r>
+        <w:rPr>
+          <w:rFonts w:ascii="Times New Roman" w:hAnsi="Times New Roman" w:cs="Times New Roman"/>
+          <w:sz w:val="24"/>
+          <w:szCs w:val="24"/>
+        </w:rPr>
+        <w:t xml:space="preserve"> pregled registriranih korisnika i njihovih podataka.</w:t>
+      </w:r>
+      <w:r>
+        <w:rPr>
+          <w:rFonts w:ascii="Times New Roman" w:hAnsi="Times New Roman" w:cs="Times New Roman"/>
+          <w:sz w:val="24"/>
+          <w:szCs w:val="24"/>
+        </w:rPr>
+        <w:t xml:space="preserve"> </w:t>
+      </w:r>
+      <w:r>
+        <w:rPr>
+          <w:rFonts w:ascii="Times New Roman" w:hAnsi="Times New Roman" w:cs="Times New Roman"/>
+          <w:sz w:val="24"/>
+          <w:szCs w:val="24"/>
+        </w:rPr>
+        <w:t>A</w:t>
+      </w:r>
+      <w:r>
+        <w:rPr>
+          <w:rFonts w:ascii="Times New Roman" w:hAnsi="Times New Roman" w:cs="Times New Roman"/>
+          <w:sz w:val="24"/>
+          <w:szCs w:val="24"/>
+        </w:rPr>
+        <w:t>dminu</w:t>
+      </w:r>
+      <w:r>
+        <w:rPr>
+          <w:rFonts w:ascii="Times New Roman" w:hAnsi="Times New Roman" w:cs="Times New Roman"/>
+          <w:sz w:val="24"/>
+          <w:szCs w:val="24"/>
+        </w:rPr>
+        <w:t xml:space="preserve"> je omogućeno</w:t>
+      </w:r>
+      <w:r>
+        <w:rPr>
+          <w:rFonts w:ascii="Times New Roman" w:hAnsi="Times New Roman" w:cs="Times New Roman"/>
+          <w:sz w:val="24"/>
+          <w:szCs w:val="24"/>
+        </w:rPr>
+        <w:t xml:space="preserve"> pretraživanje korisnika po imenu,</w:t>
+      </w:r>
+      <w:r>
+        <w:rPr>
+          <w:rFonts w:ascii="Times New Roman" w:hAnsi="Times New Roman" w:cs="Times New Roman"/>
+          <w:sz w:val="24"/>
+          <w:szCs w:val="24"/>
+        </w:rPr>
+        <w:t xml:space="preserve"> </w:t>
+      </w:r>
+      <w:r>
+        <w:rPr>
+          <w:rFonts w:ascii="Times New Roman" w:hAnsi="Times New Roman" w:cs="Times New Roman"/>
+          <w:sz w:val="24"/>
+          <w:szCs w:val="24"/>
+        </w:rPr>
+        <w:t>prezimenu ili email adresi</w:t>
+      </w:r>
+      <w:r>
+        <w:rPr>
+          <w:rFonts w:ascii="Times New Roman" w:hAnsi="Times New Roman" w:cs="Times New Roman"/>
+          <w:sz w:val="24"/>
+          <w:szCs w:val="24"/>
+        </w:rPr>
+        <w:t xml:space="preserve"> te je</w:t>
+      </w:r>
+      <w:r>
+        <w:rPr>
+          <w:rFonts w:ascii="Times New Roman" w:hAnsi="Times New Roman" w:cs="Times New Roman"/>
+          <w:sz w:val="24"/>
+          <w:szCs w:val="24"/>
+        </w:rPr>
+        <w:t xml:space="preserve"> također</w:t>
+      </w:r>
+      <w:r>
+        <w:rPr>
+          <w:rFonts w:ascii="Times New Roman" w:hAnsi="Times New Roman" w:cs="Times New Roman"/>
+          <w:sz w:val="24"/>
+          <w:szCs w:val="24"/>
+        </w:rPr>
+        <w:t xml:space="preserve"> i</w:t>
+      </w:r>
+      <w:r>
+        <w:rPr>
+          <w:rFonts w:ascii="Times New Roman" w:hAnsi="Times New Roman" w:cs="Times New Roman"/>
+          <w:sz w:val="24"/>
+          <w:szCs w:val="24"/>
+        </w:rPr>
+        <w:t xml:space="preserve"> omogućeno filtriranje podataka po korisničkim ulogama kao i opcija za prikaz</w:t>
+      </w:r>
+      <w:r>
+        <w:rPr>
+          <w:rFonts w:ascii="Times New Roman" w:hAnsi="Times New Roman" w:cs="Times New Roman"/>
+          <w:sz w:val="24"/>
+          <w:szCs w:val="24"/>
+        </w:rPr>
+        <w:t xml:space="preserve"> ostalih</w:t>
+      </w:r>
+      <w:r>
+        <w:rPr>
+          <w:rFonts w:ascii="Times New Roman" w:hAnsi="Times New Roman" w:cs="Times New Roman"/>
+          <w:sz w:val="24"/>
+          <w:szCs w:val="24"/>
+        </w:rPr>
+        <w:t xml:space="preserve"> admin korisničkih uloga.</w:t>
+      </w:r>
+      <w:r>
+        <w:rPr>
+          <w:rFonts w:ascii="Times New Roman" w:hAnsi="Times New Roman" w:cs="Times New Roman"/>
+          <w:sz w:val="24"/>
+          <w:szCs w:val="24"/>
+        </w:rPr>
+        <w:t xml:space="preserve"> Pritiskom na korisnika otvara se modalni prozor kao na slici te </w:t>
+      </w:r>
+      <w:r>
+        <w:rPr>
+          <w:rFonts w:ascii="Times New Roman" w:hAnsi="Times New Roman" w:cs="Times New Roman"/>
+          <w:sz w:val="24"/>
+          <w:szCs w:val="24"/>
+        </w:rPr>
+        <w:t>je</w:t>
+      </w:r>
+      <w:r>
+        <w:rPr>
+          <w:rFonts w:ascii="Times New Roman" w:hAnsi="Times New Roman" w:cs="Times New Roman"/>
+          <w:sz w:val="24"/>
+          <w:szCs w:val="24"/>
+        </w:rPr>
+        <w:t xml:space="preserve"> omogućena izmjena uloge korisnika</w:t>
+      </w:r>
+      <w:r>
+        <w:rPr>
+          <w:rFonts w:ascii="Times New Roman" w:hAnsi="Times New Roman" w:cs="Times New Roman"/>
+          <w:sz w:val="24"/>
+          <w:szCs w:val="24"/>
+        </w:rPr>
+        <w:t>.</w:t>
+      </w:r>
+      <w:r>
+        <w:rPr>
+          <w:rFonts w:ascii="Times New Roman" w:hAnsi="Times New Roman" w:cs="Times New Roman"/>
+          <w:sz w:val="24"/>
+          <w:szCs w:val="24"/>
+        </w:rPr>
+        <w:t xml:space="preserve"> Podaci se automatski ažuriraju kako se određeni filtri ili pretraživanje po unesenom tekstu popunjavaju.</w:t>
+      </w:r>
+    </w:p>
+    <w:p>
+      <w:pPr>
+        <w:spacing w:line="360" w:lineRule="auto"/>
+        <w:jc w:val="both"/>
+        <w:rPr>
+          <w:rFonts w:ascii="Times New Roman" w:hAnsi="Times New Roman" w:cs="Times New Roman"/>
+          <w:sz w:val="24"/>
+          <w:szCs w:val="24"/>
+        </w:rPr>
+      </w:pPr>
+      <w:r>
+        <w:rPr>
+          <w:rFonts w:ascii="Times New Roman" w:hAnsi="Times New Roman" w:cs="Times New Roman"/>
+          <w:sz w:val="24"/>
+          <w:szCs w:val="24"/>
+        </w:rPr>
+        <w:t>Pritiskom na neku od sjednica, korisnika se prebacuje na stranicu za prikaz točki dnevnoga reda vezanih za tu sjednicu. Korisnici imaju uvid u sve točke dnevnoga reda</w:t>
+      </w:r>
+      <w:r>
+        <w:rPr>
+          <w:rFonts w:ascii="Times New Roman" w:hAnsi="Times New Roman" w:cs="Times New Roman"/>
+          <w:sz w:val="24"/>
+          <w:szCs w:val="24"/>
+        </w:rPr>
+        <w:t>,</w:t>
+      </w:r>
+      <w:r>
+        <w:rPr>
+          <w:rFonts w:ascii="Times New Roman" w:hAnsi="Times New Roman" w:cs="Times New Roman"/>
+          <w:sz w:val="24"/>
+          <w:szCs w:val="24"/>
+        </w:rPr>
+        <w:t xml:space="preserve"> </w:t>
+      </w:r>
+      <w:r>
+        <w:rPr>
+          <w:rFonts w:ascii="Times New Roman" w:hAnsi="Times New Roman" w:cs="Times New Roman"/>
+          <w:sz w:val="24"/>
+          <w:szCs w:val="24"/>
+        </w:rPr>
+        <w:t xml:space="preserve">a </w:t>
+      </w:r>
+      <w:r>
+        <w:rPr>
+          <w:rFonts w:ascii="Times New Roman" w:hAnsi="Times New Roman" w:cs="Times New Roman"/>
+          <w:sz w:val="24"/>
+          <w:szCs w:val="24"/>
+        </w:rPr>
+        <w:t xml:space="preserve">ovisno o ulozi ograničene su im akcije na </w:t>
+      </w:r>
+      <w:r>
+        <w:rPr>
+          <w:rFonts w:ascii="Times New Roman" w:hAnsi="Times New Roman" w:cs="Times New Roman"/>
+          <w:sz w:val="24"/>
+          <w:szCs w:val="24"/>
+        </w:rPr>
+        <w:t xml:space="preserve">toj </w:t>
+      </w:r>
+      <w:r>
+        <w:rPr>
+          <w:rFonts w:ascii="Times New Roman" w:hAnsi="Times New Roman" w:cs="Times New Roman"/>
+          <w:sz w:val="24"/>
+          <w:szCs w:val="24"/>
+        </w:rPr>
+        <w:t xml:space="preserve">stranici. Prikaz njihovih razlika vidljiv je na </w:t>
+      </w:r>
+      <w:r>
+        <w:rPr>
+          <w:rFonts w:ascii="Times New Roman" w:hAnsi="Times New Roman" w:cs="Times New Roman"/>
+          <w:b/>
+          <w:bCs/>
+          <w:sz w:val="24"/>
+          <w:szCs w:val="24"/>
+        </w:rPr>
+        <w:t xml:space="preserve">slikama </w:t>
+      </w:r>
+      <w:r>
+        <w:rPr>
+          <w:rFonts w:ascii="Times New Roman" w:hAnsi="Times New Roman" w:cs="Times New Roman"/>
+          <w:b/>
+          <w:bCs/>
+          <w:sz w:val="24"/>
+          <w:szCs w:val="24"/>
+        </w:rPr>
+        <w:t>5</w:t>
+      </w:r>
+      <w:r>
+        <w:rPr>
+          <w:rFonts w:ascii="Times New Roman" w:hAnsi="Times New Roman" w:cs="Times New Roman"/>
+          <w:b/>
+          <w:bCs/>
+          <w:sz w:val="24"/>
+          <w:szCs w:val="24"/>
+        </w:rPr>
+        <w:t xml:space="preserve">.7 i </w:t>
+      </w:r>
+      <w:r>
+        <w:rPr>
+          <w:rFonts w:ascii="Times New Roman" w:hAnsi="Times New Roman" w:cs="Times New Roman"/>
+          <w:b/>
+          <w:bCs/>
+          <w:sz w:val="24"/>
+          <w:szCs w:val="24"/>
+        </w:rPr>
+        <w:t>5</w:t>
+      </w:r>
+      <w:r>
+        <w:rPr>
+          <w:rFonts w:ascii="Times New Roman" w:hAnsi="Times New Roman" w:cs="Times New Roman"/>
+          <w:b/>
+          <w:bCs/>
+          <w:sz w:val="24"/>
+          <w:szCs w:val="24"/>
+        </w:rPr>
+        <w:t>.8.</w:t>
+      </w:r>
+    </w:p>
+    <w:p>
+      <w:pPr>
+        <w:keepNext/>
+        <w:spacing w:line="360" w:lineRule="auto"/>
+        <w:jc w:val="both"/>
+        <w:rPr>
+          <w:rFonts w:ascii="Times New Roman" w:hAnsi="Times New Roman" w:cs="Times New Roman"/>
+        </w:rPr>
+      </w:pPr>
+      <w:r>
+        <w:rPr>
+          <w:rFonts w:ascii="Times New Roman" w:hAnsi="Times New Roman" w:cs="Times New Roman"/>
+          <w:b/>
+          <w:bCs/>
+          <w:noProof/>
+          <w:sz w:val="24"/>
+          <w:szCs w:val="24"/>
+        </w:rPr>
         <w:drawing>
           <wp:inline distT="0" distB="0" distL="0" distR="0" wp14:anchorId="7D6ABE4A" wp14:editId="4ECBDE08">
             <wp:extent cx="5939790" cy="2230120"/>
@@ -24732,7 +27060,7 @@
                     <pic:cNvPicPr/>
                   </pic:nvPicPr>
                   <pic:blipFill>
-                    <a:blip r:embed="rId58"/>
+                    <a:blip r:embed="rId64"/>
                     <a:stretch>
                       <a:fillRect/>
                     </a:stretch>
@@ -24915,7 +27243,7 @@
           <w:sz w:val="20"/>
           <w:szCs w:val="20"/>
         </w:rPr>
-        <w:t>7</w:t>
+        <w:t>12</w:t>
       </w:r>
       <w:r>
         <w:rPr>
@@ -24984,6 +27312,7 @@
           <w:sz w:val="24"/>
           <w:szCs w:val="24"/>
         </w:rPr>
+        <w:lastRenderedPageBreak/>
         <w:drawing>
           <wp:inline distT="0" distB="0" distL="0" distR="0" wp14:anchorId="50DD4D5A" wp14:editId="6AB72335">
             <wp:extent cx="5939790" cy="1946910"/>
@@ -25000,7 +27329,7 @@
                     <pic:cNvPicPr/>
                   </pic:nvPicPr>
                   <pic:blipFill>
-                    <a:blip r:embed="rId59"/>
+                    <a:blip r:embed="rId65"/>
                     <a:stretch>
                       <a:fillRect/>
                     </a:stretch>
@@ -25183,7 +27512,7 @@
           <w:sz w:val="20"/>
           <w:szCs w:val="20"/>
         </w:rPr>
-        <w:t>8</w:t>
+        <w:t>13</w:t>
       </w:r>
       <w:r>
         <w:rPr>
@@ -25511,7 +27840,6 @@
           <w:rFonts w:ascii="Times New Roman" w:hAnsi="Times New Roman" w:cs="Times New Roman"/>
           <w:noProof/>
         </w:rPr>
-        <w:lastRenderedPageBreak/>
         <mc:AlternateContent>
           <mc:Choice Requires="wps">
             <w:drawing>
@@ -25706,7 +28034,7 @@
                                 <w:sz w:val="20"/>
                                 <w:szCs w:val="20"/>
                               </w:rPr>
-                              <w:t>9</w:t>
+                              <w:t>14</w:t>
                             </w:r>
                             <w:r>
                               <w:rPr>
@@ -25922,7 +28250,7 @@
                           <w:sz w:val="20"/>
                           <w:szCs w:val="20"/>
                         </w:rPr>
-                        <w:t>9</w:t>
+                        <w:t>14</w:t>
                       </w:r>
                       <w:r>
                         <w:rPr>
@@ -25977,7 +28305,7 @@
           <w:szCs w:val="24"/>
         </w:rPr>
         <w:drawing>
-          <wp:anchor distT="0" distB="0" distL="114300" distR="114300" simplePos="0" relativeHeight="251665408" behindDoc="0" locked="0" layoutInCell="1" allowOverlap="1" wp14:anchorId="7ED8D5D7" wp14:editId="0DB68F85">
+          <wp:anchor distT="0" distB="0" distL="114300" distR="114300" simplePos="0" relativeHeight="251665408" behindDoc="0" locked="0" layoutInCell="1" allowOverlap="1" wp14:anchorId="7ED8D5D7" wp14:editId="00EF79D4">
             <wp:simplePos x="0" y="0"/>
             <wp:positionH relativeFrom="column">
               <wp:posOffset>-1270</wp:posOffset>
@@ -26000,7 +28328,7 @@
                     <pic:cNvPicPr/>
                   </pic:nvPicPr>
                   <pic:blipFill>
-                    <a:blip r:embed="rId60" cstate="print">
+                    <a:blip r:embed="rId66" cstate="print">
                       <a:extLst>
                         <a:ext uri="{28A0092B-C50C-407E-A947-70E740481C1C}">
                           <a14:useLocalDpi xmlns:a14="http://schemas.microsoft.com/office/drawing/2010/main" val="0"/>
@@ -26049,7 +28377,7 @@
                     <pic:cNvPicPr/>
                   </pic:nvPicPr>
                   <pic:blipFill>
-                    <a:blip r:embed="rId61"/>
+                    <a:blip r:embed="rId67"/>
                     <a:stretch>
                       <a:fillRect/>
                     </a:stretch>
@@ -26161,7 +28489,7 @@
                     <pic:cNvPicPr/>
                   </pic:nvPicPr>
                   <pic:blipFill>
-                    <a:blip r:embed="rId62"/>
+                    <a:blip r:embed="rId68"/>
                     <a:stretch>
                       <a:fillRect/>
                     </a:stretch>
@@ -26338,7 +28666,7 @@
           <w:sz w:val="20"/>
           <w:szCs w:val="20"/>
         </w:rPr>
-        <w:t>10</w:t>
+        <w:t>15</w:t>
       </w:r>
       <w:r>
         <w:rPr>
@@ -26727,7 +29055,7 @@
                     <pic:cNvPicPr/>
                   </pic:nvPicPr>
                   <pic:blipFill>
-                    <a:blip r:embed="rId63"/>
+                    <a:blip r:embed="rId69"/>
                     <a:stretch>
                       <a:fillRect/>
                     </a:stretch>
@@ -26905,7 +29233,7 @@
           <w:sz w:val="20"/>
           <w:szCs w:val="20"/>
         </w:rPr>
-        <w:t>11</w:t>
+        <w:t>16</w:t>
       </w:r>
       <w:r>
         <w:rPr>
@@ -26974,7 +29302,7 @@
                     <pic:cNvPicPr/>
                   </pic:nvPicPr>
                   <pic:blipFill>
-                    <a:blip r:embed="rId64"/>
+                    <a:blip r:embed="rId70"/>
                     <a:stretch>
                       <a:fillRect/>
                     </a:stretch>
@@ -27152,7 +29480,7 @@
           <w:sz w:val="20"/>
           <w:szCs w:val="20"/>
         </w:rPr>
-        <w:t>12</w:t>
+        <w:t>17</w:t>
       </w:r>
       <w:r>
         <w:rPr>
@@ -27221,7 +29549,7 @@
                     <pic:cNvPicPr/>
                   </pic:nvPicPr>
                   <pic:blipFill>
-                    <a:blip r:embed="rId65"/>
+                    <a:blip r:embed="rId71"/>
                     <a:stretch>
                       <a:fillRect/>
                     </a:stretch>
@@ -27399,7 +29727,7 @@
           <w:sz w:val="20"/>
           <w:szCs w:val="20"/>
         </w:rPr>
-        <w:t>13</w:t>
+        <w:t>18</w:t>
       </w:r>
       <w:r>
         <w:rPr>
@@ -27716,7 +30044,7 @@
                     <pic:cNvPicPr/>
                   </pic:nvPicPr>
                   <pic:blipFill>
-                    <a:blip r:embed="rId66"/>
+                    <a:blip r:embed="rId72"/>
                     <a:stretch>
                       <a:fillRect/>
                     </a:stretch>
@@ -27894,7 +30222,7 @@
           <w:sz w:val="20"/>
           <w:szCs w:val="20"/>
         </w:rPr>
-        <w:t>14</w:t>
+        <w:t>19</w:t>
       </w:r>
       <w:r>
         <w:rPr>
@@ -27963,7 +30291,7 @@
                     <pic:cNvPicPr/>
                   </pic:nvPicPr>
                   <pic:blipFill>
-                    <a:blip r:embed="rId67"/>
+                    <a:blip r:embed="rId73"/>
                     <a:stretch>
                       <a:fillRect/>
                     </a:stretch>
@@ -28141,7 +30469,7 @@
           <w:sz w:val="20"/>
           <w:szCs w:val="20"/>
         </w:rPr>
-        <w:t>15</w:t>
+        <w:t>20</w:t>
       </w:r>
       <w:r>
         <w:rPr>
@@ -28358,7 +30686,7 @@
                     <pic:cNvPicPr/>
                   </pic:nvPicPr>
                   <pic:blipFill>
-                    <a:blip r:embed="rId68"/>
+                    <a:blip r:embed="rId74"/>
                     <a:stretch>
                       <a:fillRect/>
                     </a:stretch>
@@ -28535,7 +30863,7 @@
           <w:sz w:val="20"/>
           <w:szCs w:val="20"/>
         </w:rPr>
-        <w:t>16</w:t>
+        <w:t>21</w:t>
       </w:r>
       <w:r>
         <w:rPr>
@@ -28839,7 +31167,7 @@
         </w:rPr>
         <w:t xml:space="preserve"> [online], Auth0, 2023, dostupno na: </w:t>
       </w:r>
-      <w:hyperlink r:id="rId69" w:history="1">
+      <w:hyperlink r:id="rId75" w:history="1">
         <w:r>
           <w:rPr>
             <w:rStyle w:val="Hiperveza"/>
@@ -28934,7 +31262,7 @@
         </w:rPr>
         <w:t xml:space="preserve"> [online], Axios Project, 2024, dostupno na: </w:t>
       </w:r>
-      <w:hyperlink r:id="rId70" w:history="1">
+      <w:hyperlink r:id="rId76" w:history="1">
         <w:r>
           <w:rPr>
             <w:rStyle w:val="Hiperveza"/>
@@ -29030,7 +31358,7 @@
         </w:rPr>
         <w:t xml:space="preserve"> [online], CSS-Tricks, 2023, dostupno na: </w:t>
       </w:r>
-      <w:hyperlink r:id="rId71" w:history="1">
+      <w:hyperlink r:id="rId77" w:history="1">
         <w:r>
           <w:rPr>
             <w:rStyle w:val="Hiperveza"/>

</xml_diff>